<commit_message>
Replace old /Online-Portfolio URL with the new short URL in README and resume/cover-letter docs
</commit_message>
<xml_diff>
--- a/Resume_Raihan_NWPU_MS_2027.docx
+++ b/Resume_Raihan_NWPU_MS_2027.docx
@@ -214,7 +214,7 @@
                   <w:rFonts w:ascii="Arial" w:hAnsi="Arial" w:eastAsia="Microsoft YaHei"/>
                   <w:sz w:val="15"/>
                 </w:rPr>
-                <w:t>theraihanrakibb.github.io/Online-Portfolio</w:t>
+                <w:t>theraihanrakibb.github.io</w:t>
               </w:r>
             </w:hyperlink>
           </w:p>
@@ -2077,7 +2077,7 @@
                   <w:rFonts w:ascii="Arial" w:hAnsi="Arial" w:eastAsia="Microsoft YaHei"/>
                   <w:sz w:val="14"/>
                 </w:rPr>
-                <w:t>theraihanrakibb.github.io/Online-Portfolio</w:t>
+                <w:t>theraihanrakibb.github.io</w:t>
               </w:r>
             </w:hyperlink>
           </w:p>

</xml_diff>

<commit_message>
Regenerate resume .docx from corrected source (short portfolio URL, full consistency)
</commit_message>
<xml_diff>
--- a/Resume_Raihan_NWPU_MS_2027.docx
+++ b/Resume_Raihan_NWPU_MS_2027.docx
@@ -47,7 +47,7 @@
                 <w:color w:val="1F3864"/>
                 <w:sz w:val="18"/>
               </w:rPr>
-              <w:t>AI Engineer - LLM Inference &amp; Multimodal Research (2027 New Grad)</w:t>
+              <w:t>ML Systems Engineer | LLM Inference &amp; Multimodal AI</w:t>
             </w:r>
           </w:p>
           <w:p>
@@ -63,8 +63,14 @@
                 <w:color w:val="4A5568"/>
                 <w:sz w:val="15"/>
               </w:rPr>
-              <w:t>Xi'an, China | Open to Relocation | Available July 2027</w:t>
+              <w:t>2027 New Grad · Available July 2027 · Open to Relocation · Xi'an, China</w:t>
             </w:r>
+          </w:p>
+          <w:p>
+            <w:pPr>
+              <w:spacing w:before="0" w:after="20" w:line="240" w:lineRule="auto"/>
+              <w:jc w:val="both"/>
+            </w:pPr>
           </w:p>
           <w:p>
             <w:pPr>
@@ -79,8 +85,36 @@
                 <w:color w:val="4A5568"/>
                 <w:sz w:val="15"/>
               </w:rPr>
-              <w:t>Nationality: Bangladesh | Sex: Male | DOB: 2002.12.06</w:t>
+              <w:t xml:space="preserve">Email: </w:t>
             </w:r>
+            <w:hyperlink r:id="rId9">
+              <w:r>
+                <w:rPr>
+                  <w:rFonts w:ascii="Arial" w:hAnsi="Arial" w:eastAsia="Microsoft YaHei"/>
+                  <w:sz w:val="15"/>
+                </w:rPr>
+                <w:t>raihanrakib.143@gmail.com</w:t>
+              </w:r>
+            </w:hyperlink>
+            <w:r>
+              <w:rPr>
+                <w:rFonts w:ascii="Arial" w:hAnsi="Arial" w:eastAsia="Microsoft YaHei"/>
+                <w:b w:val="0"/>
+                <w:i w:val="0"/>
+                <w:color w:val="4A5568"/>
+                <w:sz w:val="15"/>
+              </w:rPr>
+              <w:t xml:space="preserve"> · Phone: </w:t>
+            </w:r>
+            <w:hyperlink r:id="rId10">
+              <w:r>
+                <w:rPr>
+                  <w:rFonts w:ascii="Arial" w:hAnsi="Arial" w:eastAsia="Microsoft YaHei"/>
+                  <w:sz w:val="15"/>
+                </w:rPr>
+                <w:t>+86 177 2236 2949</w:t>
+              </w:r>
+            </w:hyperlink>
           </w:p>
           <w:p>
             <w:pPr>
@@ -95,47 +129,15 @@
                 <w:color w:val="4A5568"/>
                 <w:sz w:val="15"/>
               </w:rPr>
-              <w:t>Languages: Bengali (Native) | English (Fluent) | Chinese (Conversational)</w:t>
+              <w:t xml:space="preserve">GitHub: </w:t>
             </w:r>
-          </w:p>
-          <w:p>
-            <w:pPr>
-              <w:spacing w:before="0" w:after="20" w:line="240" w:lineRule="auto"/>
-              <w:jc w:val="both"/>
-            </w:pPr>
-            <w:r>
-              <w:rPr>
-                <w:rFonts w:ascii="Arial" w:hAnsi="Arial" w:eastAsia="Microsoft YaHei"/>
-                <w:b w:val="0"/>
-                <w:i w:val="0"/>
-                <w:color w:val="4A5568"/>
-                <w:sz w:val="15"/>
-              </w:rPr>
-              <w:t>Work Authorization: Requires China work visa (employer-sponsored Z Visa) | Global: Sponsorship welcome</w:t>
-            </w:r>
-          </w:p>
-          <w:p>
-            <w:pPr>
-              <w:spacing w:before="0" w:after="20" w:line="240" w:lineRule="auto"/>
-              <w:jc w:val="both"/>
-            </w:pPr>
-            <w:r>
-              <w:rPr>
-                <w:rFonts w:ascii="Arial" w:hAnsi="Arial" w:eastAsia="Microsoft YaHei"/>
-                <w:b w:val="0"/>
-                <w:i w:val="0"/>
-                <w:color w:val="4A5568"/>
-                <w:sz w:val="15"/>
-              </w:rPr>
-              <w:t xml:space="preserve">raihanrakib.143@gmail.com | </w:t>
-            </w:r>
-            <w:hyperlink r:id="rId9">
+            <w:hyperlink r:id="rId11">
               <w:r>
                 <w:rPr>
                   <w:rFonts w:ascii="Arial" w:hAnsi="Arial" w:eastAsia="Microsoft YaHei"/>
                   <w:sz w:val="15"/>
                 </w:rPr>
-                <w:t>+86-17722362949</w:t>
+                <w:t>github.com/theraihanrakibb</w:t>
               </w:r>
             </w:hyperlink>
             <w:r>
@@ -146,25 +148,9 @@
                 <w:color w:val="4A5568"/>
                 <w:sz w:val="15"/>
               </w:rPr>
-              <w:t xml:space="preserve"> | WeChat: imeddii</w:t>
+              <w:t xml:space="preserve"> · LinkedIn: </w:t>
             </w:r>
-          </w:p>
-          <w:p>
-            <w:pPr>
-              <w:spacing w:before="0" w:after="20" w:line="240" w:lineRule="auto"/>
-              <w:jc w:val="both"/>
-            </w:pPr>
-            <w:r>
-              <w:rPr>
-                <w:rFonts w:ascii="Arial" w:hAnsi="Arial" w:eastAsia="Microsoft YaHei"/>
-                <w:b w:val="0"/>
-                <w:i w:val="0"/>
-                <w:color w:val="4A5568"/>
-                <w:sz w:val="15"/>
-              </w:rPr>
-              <w:t xml:space="preserve">LinkedIn: </w:t>
-            </w:r>
-            <w:hyperlink r:id="rId10">
+            <w:hyperlink r:id="rId12">
               <w:r>
                 <w:rPr>
                   <w:rFonts w:ascii="Arial" w:hAnsi="Arial" w:eastAsia="Microsoft YaHei"/>
@@ -181,34 +167,9 @@
                 <w:color w:val="4A5568"/>
                 <w:sz w:val="15"/>
               </w:rPr>
-              <w:t xml:space="preserve"> | GitHub: </w:t>
+              <w:t xml:space="preserve"> · Portfolio: </w:t>
             </w:r>
-            <w:hyperlink r:id="rId11">
-              <w:r>
-                <w:rPr>
-                  <w:rFonts w:ascii="Arial" w:hAnsi="Arial" w:eastAsia="Microsoft YaHei"/>
-                  <w:sz w:val="15"/>
-                </w:rPr>
-                <w:t>github.com/theraihanrakibb</w:t>
-              </w:r>
-            </w:hyperlink>
-          </w:p>
-          <w:p>
-            <w:pPr>
-              <w:spacing w:before="0" w:after="20" w:line="240" w:lineRule="auto"/>
-              <w:jc w:val="both"/>
-            </w:pPr>
-            <w:r>
-              <w:rPr>
-                <w:rFonts w:ascii="Arial" w:hAnsi="Arial" w:eastAsia="Microsoft YaHei"/>
-                <w:b w:val="0"/>
-                <w:i w:val="0"/>
-                <w:color w:val="4A5568"/>
-                <w:sz w:val="15"/>
-              </w:rPr>
-              <w:t xml:space="preserve">Portfolio: </w:t>
-            </w:r>
-            <w:hyperlink r:id="rId12">
+            <w:hyperlink r:id="rId13">
               <w:r>
                 <w:rPr>
                   <w:rFonts w:ascii="Arial" w:hAnsi="Arial" w:eastAsia="Microsoft YaHei"/>
@@ -244,7 +205,7 @@
                           <pic:cNvPicPr/>
                         </pic:nvPicPr>
                         <pic:blipFill>
-                          <a:blip r:embed="rId13"/>
+                          <a:blip r:embed="rId14"/>
                           <a:stretch>
                             <a:fillRect/>
                           </a:stretch>
@@ -305,127 +266,7 @@
           <w:color w:val="111827"/>
           <w:sz w:val="17"/>
         </w:rPr>
-        <w:t xml:space="preserve">2027 New Grad AI Engineer focused on LLM inference systems and multimodal research. Built and deployed LLM serving on </w:t>
-      </w:r>
-      <w:r>
-        <w:rPr>
-          <w:rFonts w:ascii="Arial" w:hAnsi="Arial" w:eastAsia="Microsoft YaHei"/>
-          <w:b/>
-          <w:i w:val="0"/>
-          <w:color w:val="111827"/>
-          <w:sz w:val="17"/>
-        </w:rPr>
-        <w:t>4x A800</w:t>
-      </w:r>
-      <w:r>
-        <w:rPr>
-          <w:rFonts w:ascii="Arial" w:hAnsi="Arial" w:eastAsia="Microsoft YaHei"/>
-          <w:b w:val="0"/>
-          <w:i w:val="0"/>
-          <w:color w:val="111827"/>
-          <w:sz w:val="17"/>
-        </w:rPr>
-        <w:t xml:space="preserve"> clusters at </w:t>
-      </w:r>
-      <w:r>
-        <w:rPr>
-          <w:rFonts w:ascii="Arial" w:hAnsi="Arial" w:eastAsia="Microsoft YaHei"/>
-          <w:b/>
-          <w:i w:val="0"/>
-          <w:color w:val="111827"/>
-          <w:sz w:val="17"/>
-        </w:rPr>
-        <w:t>InfiX.ai</w:t>
-      </w:r>
-      <w:r>
-        <w:rPr>
-          <w:rFonts w:ascii="Arial" w:hAnsi="Arial" w:eastAsia="Microsoft YaHei"/>
-          <w:b w:val="0"/>
-          <w:i w:val="0"/>
-          <w:color w:val="111827"/>
-          <w:sz w:val="17"/>
-        </w:rPr>
-        <w:t xml:space="preserve"> (SGLang, KV-cache offload, PD-disaggregation - </w:t>
-      </w:r>
-      <w:r>
-        <w:rPr>
-          <w:rFonts w:ascii="Arial" w:hAnsi="Arial" w:eastAsia="Microsoft YaHei"/>
-          <w:b/>
-          <w:i w:val="0"/>
-          <w:color w:val="111827"/>
-          <w:sz w:val="17"/>
-        </w:rPr>
-        <w:t>92.27% cache hit</w:t>
-      </w:r>
-      <w:r>
-        <w:rPr>
-          <w:rFonts w:ascii="Arial" w:hAnsi="Arial" w:eastAsia="Microsoft YaHei"/>
-          <w:b w:val="0"/>
-          <w:i w:val="0"/>
-          <w:color w:val="111827"/>
-          <w:sz w:val="17"/>
-        </w:rPr>
-        <w:t xml:space="preserve">, </w:t>
-      </w:r>
-      <w:r>
-        <w:rPr>
-          <w:rFonts w:ascii="Arial" w:hAnsi="Arial" w:eastAsia="Microsoft YaHei"/>
-          <w:b/>
-          <w:i w:val="0"/>
-          <w:color w:val="111827"/>
-          <w:sz w:val="17"/>
-        </w:rPr>
-        <w:t>8.3x faster TTFT</w:t>
-      </w:r>
-      <w:r>
-        <w:rPr>
-          <w:rFonts w:ascii="Arial" w:hAnsi="Arial" w:eastAsia="Microsoft YaHei"/>
-          <w:b w:val="0"/>
-          <w:i w:val="0"/>
-          <w:color w:val="111827"/>
-          <w:sz w:val="17"/>
-        </w:rPr>
-        <w:t xml:space="preserve">). </w:t>
-      </w:r>
-      <w:r>
-        <w:rPr>
-          <w:rFonts w:ascii="Arial" w:hAnsi="Arial" w:eastAsia="Microsoft YaHei"/>
-          <w:b/>
-          <w:i w:val="0"/>
-          <w:color w:val="111827"/>
-          <w:sz w:val="17"/>
-        </w:rPr>
-        <w:t>First author</w:t>
-      </w:r>
-      <w:r>
-        <w:rPr>
-          <w:rFonts w:ascii="Arial" w:hAnsi="Arial" w:eastAsia="Microsoft YaHei"/>
-          <w:b w:val="0"/>
-          <w:i w:val="0"/>
-          <w:color w:val="111827"/>
-          <w:sz w:val="17"/>
-        </w:rPr>
-        <w:t>, IEEE TNNLS (</w:t>
-      </w:r>
-      <w:r>
-        <w:rPr>
-          <w:rFonts w:ascii="Arial" w:hAnsi="Arial" w:eastAsia="Microsoft YaHei"/>
-          <w:b/>
-          <w:i w:val="0"/>
-          <w:color w:val="111827"/>
-          <w:sz w:val="17"/>
-        </w:rPr>
-        <w:t>Q1</w:t>
-      </w:r>
-      <w:r>
-        <w:rPr>
-          <w:rFonts w:ascii="Arial" w:hAnsi="Arial" w:eastAsia="Microsoft YaHei"/>
-          <w:b w:val="0"/>
-          <w:i w:val="0"/>
-          <w:color w:val="111827"/>
-          <w:sz w:val="17"/>
-        </w:rPr>
-        <w:t>). Seeking AI / Research Engineer roles in China, Hong Kong, and globally.</w:t>
+        <w:t>ML Systems Engineer focused on LLM inference, GPU optimization, and multimodal generative AI. At InfiX.ai, optimized production LLM serving - Qwen on 4× A800 and DeepSeek on multi-node H200 clusters - reducing long-context TTFT 8.3× (55s→6.7s) via 3-tier KV-cache offload and raising stable concurrency 192→256 via RDMA-based prefill/decode disaggregation. First author of an IEEE TNNLS manuscript on NVFP4 4-bit audio-guided video diffusion (4× memory reduction on H100). Strong in SGLang, CUDA/Triton, low-precision inference, and distributed systems.</w:t>
       </w:r>
     </w:p>
     <w:p>
@@ -460,9 +301,9 @@
           <w:color w:val="111827"/>
           <w:sz w:val="17"/>
         </w:rPr>
-        <w:t xml:space="preserve">AI Infrastructure Engineer Intern | </w:t>
+        <w:t xml:space="preserve">AI Infrastructure Engineer Intern, </w:t>
       </w:r>
-      <w:hyperlink r:id="rId14">
+      <w:hyperlink r:id="rId15">
         <w:r>
           <w:rPr>
             <w:rFonts w:ascii="Arial" w:hAnsi="Arial" w:eastAsia="Microsoft YaHei"/>
@@ -479,7 +320,7 @@
           <w:color w:val="111827"/>
           <w:sz w:val="17"/>
         </w:rPr>
-        <w:t xml:space="preserve"> | Shenzhen, China | Apr 2026 - Jun 2026</w:t>
+        <w:t>, Shenzhen, China, Apr 2026 - Jun 2026</w:t>
       </w:r>
     </w:p>
     <w:p>
@@ -496,7 +337,27 @@
           <w:color w:val="111827"/>
           <w:sz w:val="17"/>
         </w:rPr>
-        <w:t>•  Cut TTFT 8.3x (55s -&gt; 6.7s) by building a 3-tier KV-cache offload (GPU HBM -&gt; CPU DRAM -&gt; SSD) over Mooncake RDMA on 4x A800, reaching 92.27% cache-hit for long-context models.</w:t>
+        <w:t xml:space="preserve">•  Reduced long-context TTFT 8.3× (55s→6.7s) and sustained a </w:t>
+      </w:r>
+      <w:r>
+        <w:rPr>
+          <w:rFonts w:ascii="Arial" w:hAnsi="Arial" w:eastAsia="Microsoft YaHei"/>
+          <w:b/>
+          <w:i w:val="0"/>
+          <w:color w:val="111827"/>
+          <w:sz w:val="17"/>
+        </w:rPr>
+        <w:t>92%</w:t>
+      </w:r>
+      <w:r>
+        <w:rPr>
+          <w:rFonts w:ascii="Arial" w:hAnsi="Arial" w:eastAsia="Microsoft YaHei"/>
+          <w:b w:val="0"/>
+          <w:i w:val="0"/>
+          <w:color w:val="111827"/>
+          <w:sz w:val="17"/>
+        </w:rPr>
+        <w:t xml:space="preserve"> cache hit rate by designing and deploying a 3-tier KV-cache offload system (GPU HBM → CPU DRAM → SSD) over Mooncake RDMA for Qwen3.5/3.6-27B on 4× A800-80GB (32K+ token contexts).</w:t>
       </w:r>
     </w:p>
     <w:p>
@@ -513,7 +374,7 @@
           <w:color w:val="111827"/>
           <w:sz w:val="17"/>
         </w:rPr>
-        <w:t>•  Patched SGLang source across cache-management and memory-allocation modules (kvcacheio.py, hiradix_cache.py, memory_pool_host.py) to fix production cache failures and deploy hybrid-attention Qwen models.</w:t>
+        <w:t>•  Improved stable serving concurrency 33% (192→256 requests) by implementing 2+2 GPU prefill/decode disaggregation with RDMA-based KV transfer, RadixAttention prefix caching, and continuous batching for Qwen3.6-27B.</w:t>
       </w:r>
     </w:p>
     <w:p>
@@ -530,7 +391,127 @@
           <w:color w:val="111827"/>
           <w:sz w:val="17"/>
         </w:rPr>
-        <w:t>•  Built PD-disaggregated (prefill/decode) serving with RDMA KV sharing, raising stable concurrency 192 -&gt; 256 req and boosting GPU utilization via RadixAttention prefix-caching and continuous batching.</w:t>
+        <w:t xml:space="preserve">•  Modified </w:t>
+      </w:r>
+      <w:r>
+        <w:rPr>
+          <w:rFonts w:ascii="Arial" w:hAnsi="Arial" w:eastAsia="Microsoft YaHei"/>
+          <w:b/>
+          <w:i w:val="0"/>
+          <w:color w:val="111827"/>
+          <w:sz w:val="17"/>
+        </w:rPr>
+        <w:t>SGLang</w:t>
+      </w:r>
+      <w:r>
+        <w:rPr>
+          <w:rFonts w:ascii="Arial" w:hAnsi="Arial" w:eastAsia="Microsoft YaHei"/>
+          <w:b w:val="0"/>
+          <w:i w:val="0"/>
+          <w:color w:val="111827"/>
+          <w:sz w:val="17"/>
+        </w:rPr>
+        <w:t xml:space="preserve"> cache-management and memory-allocation internals (</w:t>
+      </w:r>
+      <w:r>
+        <w:rPr>
+          <w:rFonts w:ascii="Arial" w:hAnsi="Arial" w:eastAsia="Microsoft YaHei"/>
+          <w:b w:val="0"/>
+          <w:i/>
+          <w:color w:val="111827"/>
+          <w:sz w:val="17"/>
+        </w:rPr>
+        <w:t>kvcacheio.py</w:t>
+      </w:r>
+      <w:r>
+        <w:rPr>
+          <w:rFonts w:ascii="Arial" w:hAnsi="Arial" w:eastAsia="Microsoft YaHei"/>
+          <w:b w:val="0"/>
+          <w:i w:val="0"/>
+          <w:color w:val="111827"/>
+          <w:sz w:val="17"/>
+        </w:rPr>
+        <w:t xml:space="preserve">, </w:t>
+      </w:r>
+      <w:r>
+        <w:rPr>
+          <w:rFonts w:ascii="Arial" w:hAnsi="Arial" w:eastAsia="Microsoft YaHei"/>
+          <w:b w:val="0"/>
+          <w:i/>
+          <w:color w:val="111827"/>
+          <w:sz w:val="17"/>
+        </w:rPr>
+        <w:t>memory_pool_host.py</w:t>
+      </w:r>
+      <w:r>
+        <w:rPr>
+          <w:rFonts w:ascii="Arial" w:hAnsi="Arial" w:eastAsia="Microsoft YaHei"/>
+          <w:b w:val="0"/>
+          <w:i w:val="0"/>
+          <w:color w:val="111827"/>
+          <w:sz w:val="17"/>
+        </w:rPr>
+        <w:t xml:space="preserve">, </w:t>
+      </w:r>
+      <w:r>
+        <w:rPr>
+          <w:rFonts w:ascii="Arial" w:hAnsi="Arial" w:eastAsia="Microsoft YaHei"/>
+          <w:b w:val="0"/>
+          <w:i/>
+          <w:color w:val="111827"/>
+          <w:sz w:val="17"/>
+        </w:rPr>
+        <w:t>hi_mamba_radix_cache.py</w:t>
+      </w:r>
+      <w:r>
+        <w:rPr>
+          <w:rFonts w:ascii="Arial" w:hAnsi="Arial" w:eastAsia="Microsoft YaHei"/>
+          <w:b w:val="0"/>
+          <w:i w:val="0"/>
+          <w:color w:val="111827"/>
+          <w:sz w:val="17"/>
+        </w:rPr>
+        <w:t xml:space="preserve">) - across </w:t>
+      </w:r>
+      <w:r>
+        <w:rPr>
+          <w:rFonts w:ascii="Arial" w:hAnsi="Arial" w:eastAsia="Microsoft YaHei"/>
+          <w:b/>
+          <w:i w:val="0"/>
+          <w:color w:val="111827"/>
+          <w:sz w:val="17"/>
+        </w:rPr>
+        <w:t>v0.5.9</w:t>
+      </w:r>
+      <w:r>
+        <w:rPr>
+          <w:rFonts w:ascii="Arial" w:hAnsi="Arial" w:eastAsia="Microsoft YaHei"/>
+          <w:b w:val="0"/>
+          <w:i w:val="0"/>
+          <w:color w:val="111827"/>
+          <w:sz w:val="17"/>
+        </w:rPr>
+        <w:t xml:space="preserve"> (A800) and </w:t>
+      </w:r>
+      <w:r>
+        <w:rPr>
+          <w:rFonts w:ascii="Arial" w:hAnsi="Arial" w:eastAsia="Microsoft YaHei"/>
+          <w:b/>
+          <w:i w:val="0"/>
+          <w:color w:val="111827"/>
+          <w:sz w:val="17"/>
+        </w:rPr>
+        <w:t>v0.5.10-post2</w:t>
+      </w:r>
+      <w:r>
+        <w:rPr>
+          <w:rFonts w:ascii="Arial" w:hAnsi="Arial" w:eastAsia="Microsoft YaHei"/>
+          <w:b w:val="0"/>
+          <w:i w:val="0"/>
+          <w:color w:val="111827"/>
+          <w:sz w:val="17"/>
+        </w:rPr>
+        <w:t xml:space="preserve"> container image (H200) - to resolve production cache failures and support hybrid-attention (Mamba + full-attention) Qwen models.</w:t>
       </w:r>
     </w:p>
     <w:p>
@@ -547,7 +528,47 @@
           <w:color w:val="111827"/>
           <w:sz w:val="17"/>
         </w:rPr>
-        <w:t>•  Profiled CUDA/Triton inference with Nsight Systems, localized GEMM bottlenecks, and improved serving throughput via kernel optimization and FP8 quantization.</w:t>
+        <w:t xml:space="preserve">•  Profiled CUDA/Triton inference with </w:t>
+      </w:r>
+      <w:r>
+        <w:rPr>
+          <w:rFonts w:ascii="Arial" w:hAnsi="Arial" w:eastAsia="Microsoft YaHei"/>
+          <w:b/>
+          <w:i w:val="0"/>
+          <w:color w:val="111827"/>
+          <w:sz w:val="17"/>
+        </w:rPr>
+        <w:t>Nsight Systems</w:t>
+      </w:r>
+      <w:r>
+        <w:rPr>
+          <w:rFonts w:ascii="Arial" w:hAnsi="Arial" w:eastAsia="Microsoft YaHei"/>
+          <w:b w:val="0"/>
+          <w:i w:val="0"/>
+          <w:color w:val="111827"/>
+          <w:sz w:val="17"/>
+        </w:rPr>
+        <w:t xml:space="preserve">: GEMM accounted for </w:t>
+      </w:r>
+      <w:r>
+        <w:rPr>
+          <w:rFonts w:ascii="Arial" w:hAnsi="Arial" w:eastAsia="Microsoft YaHei"/>
+          <w:b/>
+          <w:i w:val="0"/>
+          <w:color w:val="111827"/>
+          <w:sz w:val="17"/>
+        </w:rPr>
+        <w:t>60%</w:t>
+      </w:r>
+      <w:r>
+        <w:rPr>
+          <w:rFonts w:ascii="Arial" w:hAnsi="Arial" w:eastAsia="Microsoft YaHei"/>
+          <w:b w:val="0"/>
+          <w:i w:val="0"/>
+          <w:color w:val="111827"/>
+          <w:sz w:val="17"/>
+        </w:rPr>
+        <w:t xml:space="preserve"> of step time, redirecting optimization from cache I/O to compute kernels; FP8 KV cache halved per-token KV memory (72.9 → 36.5 KB).</w:t>
       </w:r>
     </w:p>
     <w:p>
@@ -564,15 +585,18 @@
           <w:color w:val="111827"/>
           <w:sz w:val="17"/>
         </w:rPr>
-        <w:t>•  Applied Little's Law to model capacity limits, proving long-context serving on 4x A800-80GB was bounded to ~1.5 RPS and guiding scale-out.</w:t>
+        <w:t xml:space="preserve">•  Deployed Qwen3-235B-A22B-FP8 (235B MoE) on 2× H200 and benchmarked DeepSeek-V3.2 (FP8) on 8× H200 - </w:t>
       </w:r>
-    </w:p>
-    <w:p>
-      <w:pPr>
-        <w:spacing w:before="0" w:after="20" w:line="240" w:lineRule="auto"/>
-        <w:ind w:left="255" w:hanging="150"/>
-        <w:jc w:val="both"/>
-      </w:pPr>
+      <w:r>
+        <w:rPr>
+          <w:rFonts w:ascii="Arial" w:hAnsi="Arial" w:eastAsia="Microsoft YaHei"/>
+          <w:b/>
+          <w:i w:val="0"/>
+          <w:color w:val="111827"/>
+          <w:sz w:val="17"/>
+        </w:rPr>
+        <w:t>91 ms TTFT / 36 ms TPOT</w:t>
+      </w:r>
       <w:r>
         <w:rPr>
           <w:rFonts w:ascii="Arial" w:hAnsi="Arial" w:eastAsia="Microsoft YaHei"/>
@@ -581,15 +605,18 @@
           <w:color w:val="111827"/>
           <w:sz w:val="17"/>
         </w:rPr>
-        <w:t>•  Diagnosed and resolved 12+ production incidents across RDMA, etcd, networking, storage, and distributed inference.</w:t>
+        <w:t xml:space="preserve"> at 32-64 concurrency, </w:t>
       </w:r>
-    </w:p>
-    <w:p>
-      <w:pPr>
-        <w:spacing w:before="0" w:after="20" w:line="240" w:lineRule="auto"/>
-        <w:ind w:left="255" w:hanging="150"/>
-        <w:jc w:val="both"/>
-      </w:pPr>
+      <w:r>
+        <w:rPr>
+          <w:rFonts w:ascii="Arial" w:hAnsi="Arial" w:eastAsia="Microsoft YaHei"/>
+          <w:b/>
+          <w:i w:val="0"/>
+          <w:color w:val="111827"/>
+          <w:sz w:val="17"/>
+        </w:rPr>
+        <w:t>13.16 req/s</w:t>
+      </w:r>
       <w:r>
         <w:rPr>
           <w:rFonts w:ascii="Arial" w:hAnsi="Arial" w:eastAsia="Microsoft YaHei"/>
@@ -598,7 +625,7 @@
           <w:color w:val="111827"/>
           <w:sz w:val="17"/>
         </w:rPr>
-        <w:t>•  Deployed Qwen models on A800 clusters (TP2 single-node, TP4 with PD-disaggregation) and ran DeepSeek on H800 multi-node clusters (8 GPUs each), tuning tensor-parallel layouts for throughput and stability.</w:t>
+        <w:t xml:space="preserve"> at 256 concurrency.</w:t>
       </w:r>
     </w:p>
     <w:p>
@@ -633,9 +660,9 @@
           <w:color w:val="111827"/>
           <w:sz w:val="17"/>
         </w:rPr>
-        <w:t xml:space="preserve">Graduate Researcher | </w:t>
+        <w:t xml:space="preserve">Graduate Researcher, </w:t>
       </w:r>
-      <w:hyperlink r:id="rId15">
+      <w:hyperlink r:id="rId16">
         <w:r>
           <w:rPr>
             <w:rFonts w:ascii="Arial" w:hAnsi="Arial" w:eastAsia="Microsoft YaHei"/>
@@ -652,7 +679,7 @@
           <w:color w:val="111827"/>
           <w:sz w:val="17"/>
         </w:rPr>
-        <w:t xml:space="preserve"> | Sep 2024 - Present</w:t>
+        <w:t>, Sep 2024 - Present</w:t>
       </w:r>
     </w:p>
     <w:p>
@@ -670,7 +697,7 @@
         </w:rPr>
         <w:t xml:space="preserve">Advisor: Prof. </w:t>
       </w:r>
-      <w:hyperlink r:id="rId16">
+      <w:hyperlink r:id="rId17">
         <w:r>
           <w:rPr>
             <w:rFonts w:ascii="Arial" w:hAnsi="Arial" w:eastAsia="Microsoft YaHei"/>
@@ -734,7 +761,7 @@
           <w:color w:val="111827"/>
           <w:sz w:val="17"/>
         </w:rPr>
-        <w:t xml:space="preserve"> achieving </w:t>
+        <w:t xml:space="preserve">, with custom FP4-packed </w:t>
       </w:r>
       <w:r>
         <w:rPr>
@@ -744,7 +771,7 @@
           <w:color w:val="111827"/>
           <w:sz w:val="17"/>
         </w:rPr>
-        <w:t>4x memory reduction</w:t>
+        <w:t>Triton</w:t>
       </w:r>
       <w:r>
         <w:rPr>
@@ -754,7 +781,47 @@
           <w:color w:val="111827"/>
           <w:sz w:val="17"/>
         </w:rPr>
-        <w:t xml:space="preserve"> while maintaining generation quality.</w:t>
+        <w:t xml:space="preserve"> kernels that are </w:t>
+      </w:r>
+      <w:r>
+        <w:rPr>
+          <w:rFonts w:ascii="Arial" w:hAnsi="Arial" w:eastAsia="Microsoft YaHei"/>
+          <w:b/>
+          <w:i w:val="0"/>
+          <w:color w:val="111827"/>
+          <w:sz w:val="17"/>
+        </w:rPr>
+        <w:t>3.2× faster than FP16</w:t>
+      </w:r>
+      <w:r>
+        <w:rPr>
+          <w:rFonts w:ascii="Arial" w:hAnsi="Arial" w:eastAsia="Microsoft YaHei"/>
+          <w:b w:val="0"/>
+          <w:i w:val="0"/>
+          <w:color w:val="111827"/>
+          <w:sz w:val="17"/>
+        </w:rPr>
+        <w:t xml:space="preserve"> (2.1× over naive FP4) and cut memory </w:t>
+      </w:r>
+      <w:r>
+        <w:rPr>
+          <w:rFonts w:ascii="Arial" w:hAnsi="Arial" w:eastAsia="Microsoft YaHei"/>
+          <w:b/>
+          <w:i w:val="0"/>
+          <w:color w:val="111827"/>
+          <w:sz w:val="17"/>
+        </w:rPr>
+        <w:t>4×</w:t>
+      </w:r>
+      <w:r>
+        <w:rPr>
+          <w:rFonts w:ascii="Arial" w:hAnsi="Arial" w:eastAsia="Microsoft YaHei"/>
+          <w:b w:val="0"/>
+          <w:i w:val="0"/>
+          <w:color w:val="111827"/>
+          <w:sz w:val="17"/>
+        </w:rPr>
+        <w:t xml:space="preserve"> at competitive generation quality.</w:t>
       </w:r>
     </w:p>
     <w:p>
@@ -771,7 +838,7 @@
           <w:color w:val="111827"/>
           <w:sz w:val="17"/>
         </w:rPr>
-        <w:t>•  Implemented low-precision quantization (</w:t>
+        <w:t xml:space="preserve">•  Implemented adaptive block-wise </w:t>
       </w:r>
       <w:r>
         <w:rPr>
@@ -791,7 +858,7 @@
           <w:color w:val="111827"/>
           <w:sz w:val="17"/>
         </w:rPr>
-        <w:t>) for multimodal diffusion transformers; evaluated quality-efficiency trade-offs.</w:t>
+        <w:t xml:space="preserve"> quantization and quantization-aware training with learnable per-head cross-modal scales; evaluated trade-offs on WebVid-10M, VGGSound, and UCF-101.</w:t>
       </w:r>
     </w:p>
     <w:p>
@@ -808,7 +875,7 @@
           <w:color w:val="111827"/>
           <w:sz w:val="17"/>
         </w:rPr>
-        <w:t xml:space="preserve">•  Benchmarked NVFP4-DiT on </w:t>
+        <w:t xml:space="preserve">•  Built a </w:t>
       </w:r>
       <w:r>
         <w:rPr>
@@ -818,7 +885,7 @@
           <w:color w:val="111827"/>
           <w:sz w:val="17"/>
         </w:rPr>
-        <w:t>A800/H100 GPUs</w:t>
+        <w:t>vLLM-style serving scheduler</w:t>
       </w:r>
       <w:r>
         <w:rPr>
@@ -828,7 +895,27 @@
           <w:color w:val="111827"/>
           <w:sz w:val="17"/>
         </w:rPr>
-        <w:t>; profiled end-to-end latency and memory with PyTorch Profiler and Nsight to guide low-precision kernel choices.</w:t>
+        <w:t xml:space="preserve"> (frame-level paged attention, dynamic frame batching) and benchmarked on </w:t>
+      </w:r>
+      <w:r>
+        <w:rPr>
+          <w:rFonts w:ascii="Arial" w:hAnsi="Arial" w:eastAsia="Microsoft YaHei"/>
+          <w:b/>
+          <w:i w:val="0"/>
+          <w:color w:val="111827"/>
+          <w:sz w:val="17"/>
+        </w:rPr>
+        <w:t>H100 GPUs</w:t>
+      </w:r>
+      <w:r>
+        <w:rPr>
+          <w:rFonts w:ascii="Arial" w:hAnsi="Arial" w:eastAsia="Microsoft YaHei"/>
+          <w:b w:val="0"/>
+          <w:i w:val="0"/>
+          <w:color w:val="111827"/>
+          <w:sz w:val="17"/>
+        </w:rPr>
+        <w:t xml:space="preserve"> using PyTorch Profiler and Nsight to guide low-precision kernel choices.</w:t>
       </w:r>
     </w:p>
     <w:p>
@@ -878,9 +965,9 @@
           <w:color w:val="111827"/>
           <w:sz w:val="17"/>
         </w:rPr>
-        <w:t xml:space="preserve">Undergraduate Researcher | </w:t>
+        <w:t xml:space="preserve">Undergraduate Researcher, </w:t>
       </w:r>
-      <w:hyperlink r:id="rId15">
+      <w:hyperlink r:id="rId16">
         <w:r>
           <w:rPr>
             <w:rFonts w:ascii="Arial" w:hAnsi="Arial" w:eastAsia="Microsoft YaHei"/>
@@ -897,7 +984,7 @@
           <w:color w:val="111827"/>
           <w:sz w:val="17"/>
         </w:rPr>
-        <w:t xml:space="preserve"> | Jan 2023 - Jul 2024</w:t>
+        <w:t>, Jan 2023 - Jul 2024</w:t>
       </w:r>
     </w:p>
     <w:p>
@@ -915,7 +1002,7 @@
         </w:rPr>
         <w:t xml:space="preserve">Advisor: Dr. </w:t>
       </w:r>
-      <w:hyperlink r:id="rId17">
+      <w:hyperlink r:id="rId18">
         <w:r>
           <w:rPr>
             <w:rFonts w:ascii="Arial" w:hAnsi="Arial" w:eastAsia="Microsoft YaHei"/>
@@ -939,7 +1026,27 @@
           <w:color w:val="111827"/>
           <w:sz w:val="17"/>
         </w:rPr>
-        <w:t xml:space="preserve">•  Designed and built a distributed confidential-query framework on Apache Spark + CKKS homomorphic encryption, achieving </w:t>
+        <w:t xml:space="preserve">•  Designed and built a distributed confidential-query framework on Apache Spark + CKKS homomorphic encryption, validated on a </w:t>
+      </w:r>
+      <w:r>
+        <w:rPr>
+          <w:rFonts w:ascii="Arial" w:hAnsi="Arial" w:eastAsia="Microsoft YaHei"/>
+          <w:b/>
+          <w:i w:val="0"/>
+          <w:color w:val="111827"/>
+          <w:sz w:val="17"/>
+        </w:rPr>
+        <w:t>10-node cluster</w:t>
+      </w:r>
+      <w:r>
+        <w:rPr>
+          <w:rFonts w:ascii="Arial" w:hAnsi="Arial" w:eastAsia="Microsoft YaHei"/>
+          <w:b w:val="0"/>
+          <w:i w:val="0"/>
+          <w:color w:val="111827"/>
+          <w:sz w:val="17"/>
+        </w:rPr>
+        <w:t xml:space="preserve">: </w:t>
       </w:r>
       <w:r>
         <w:rPr>
@@ -1031,9 +1138,9 @@
           <w:color w:val="111827"/>
           <w:sz w:val="17"/>
         </w:rPr>
-        <w:t xml:space="preserve">AI Infra Portfolio | </w:t>
+        <w:t xml:space="preserve">AI Infrastructure Portfolio, </w:t>
       </w:r>
-      <w:hyperlink r:id="rId18">
+      <w:hyperlink r:id="rId19">
         <w:r>
           <w:rPr>
             <w:rFonts w:ascii="Arial" w:hAnsi="Arial" w:eastAsia="Microsoft YaHei"/>
@@ -1057,7 +1164,7 @@
           <w:color w:val="111827"/>
           <w:sz w:val="17"/>
         </w:rPr>
-        <w:t>•  10 production-grade, Dockerized AI-infra projects: LLM gateway, model serving, GPU observability, training ops, MLOps registry, KV-cache simulator, benchmarking, quantization, tracing, RAG.</w:t>
+        <w:t>•  Designed and shipped 10 Dockerized AI-infra services - LLM gateway, model serving, GPU observability, KV-cache simulation, benchmarking, quantization, tracing, and RAG - each with CI and a reproducible quickstart.</w:t>
       </w:r>
     </w:p>
     <w:p>
@@ -1073,9 +1180,9 @@
           <w:color w:val="111827"/>
           <w:sz w:val="17"/>
         </w:rPr>
-        <w:t xml:space="preserve">Distributed Training Launcher | </w:t>
+        <w:t xml:space="preserve">Distributed Training Launcher, </w:t>
       </w:r>
-      <w:hyperlink r:id="rId19">
+      <w:hyperlink r:id="rId20">
         <w:r>
           <w:rPr>
             <w:rFonts w:ascii="Arial" w:hAnsi="Arial" w:eastAsia="Microsoft YaHei"/>
@@ -1099,133 +1206,7 @@
           <w:color w:val="111827"/>
           <w:sz w:val="17"/>
         </w:rPr>
-        <w:t>•  CLI for multi-node PyTorch training with fault tolerance and automatic retry; cut manual ops overhead for distributed jobs.</w:t>
-      </w:r>
-    </w:p>
-    <w:p>
-      <w:pPr>
-        <w:spacing w:before="30" w:after="10" w:line="240" w:lineRule="auto"/>
-        <w:jc w:val="left"/>
-      </w:pPr>
-      <w:r>
-        <w:rPr>
-          <w:rFonts w:ascii="Arial" w:hAnsi="Arial" w:eastAsia="Microsoft YaHei"/>
-          <w:b/>
-          <w:i w:val="0"/>
-          <w:color w:val="111827"/>
-          <w:sz w:val="17"/>
-        </w:rPr>
-        <w:t xml:space="preserve">C Compiler (Frontend) | </w:t>
-      </w:r>
-      <w:hyperlink r:id="rId20">
-        <w:r>
-          <w:rPr>
-            <w:rFonts w:ascii="Arial" w:hAnsi="Arial" w:eastAsia="Microsoft YaHei"/>
-            <w:sz w:val="17"/>
-          </w:rPr>
-          <w:t>github.com/theraihanrakibb/c-compiler-frontend</w:t>
-        </w:r>
-      </w:hyperlink>
-    </w:p>
-    <w:p>
-      <w:pPr>
-        <w:spacing w:before="0" w:after="20" w:line="240" w:lineRule="auto"/>
-        <w:ind w:left="255" w:hanging="150"/>
-        <w:jc w:val="both"/>
-      </w:pPr>
-      <w:r>
-        <w:rPr>
-          <w:rFonts w:ascii="Arial" w:hAnsi="Arial" w:eastAsia="Microsoft YaHei"/>
-          <w:b w:val="0"/>
-          <w:i w:val="0"/>
-          <w:color w:val="111827"/>
-          <w:sz w:val="17"/>
-        </w:rPr>
-        <w:t>•  Self-built C compiler (lexer/parser/codegen) using Yacc/Lex; applied systems and algorithms fundamentals.</w:t>
-      </w:r>
-    </w:p>
-    <w:p>
-      <w:pPr>
-        <w:spacing w:before="30" w:after="10" w:line="240" w:lineRule="auto"/>
-        <w:jc w:val="left"/>
-      </w:pPr>
-      <w:r>
-        <w:rPr>
-          <w:rFonts w:ascii="Arial" w:hAnsi="Arial" w:eastAsia="Microsoft YaHei"/>
-          <w:b/>
-          <w:i w:val="0"/>
-          <w:color w:val="111827"/>
-          <w:sz w:val="17"/>
-        </w:rPr>
-        <w:t xml:space="preserve">NVFP4-DiT (Multimodal Generation) | </w:t>
-      </w:r>
-      <w:hyperlink r:id="rId21">
-        <w:r>
-          <w:rPr>
-            <w:rFonts w:ascii="Arial" w:hAnsi="Arial" w:eastAsia="Microsoft YaHei"/>
-            <w:sz w:val="17"/>
-          </w:rPr>
-          <w:t>github.com/theraihanrakibb/NVFP4-DiT</w:t>
-        </w:r>
-      </w:hyperlink>
-    </w:p>
-    <w:p>
-      <w:pPr>
-        <w:spacing w:before="0" w:after="20" w:line="240" w:lineRule="auto"/>
-        <w:ind w:left="255" w:hanging="150"/>
-        <w:jc w:val="both"/>
-      </w:pPr>
-      <w:r>
-        <w:rPr>
-          <w:rFonts w:ascii="Arial" w:hAnsi="Arial" w:eastAsia="Microsoft YaHei"/>
-          <w:b w:val="0"/>
-          <w:i w:val="0"/>
-          <w:color w:val="111827"/>
-          <w:sz w:val="17"/>
-        </w:rPr>
-        <w:t>•  First-author IEEE TNNLS (Q1, under review) 4-bit audio-guided video diffusion transformer; 4x memory reduction while preserving generation quality on A800/H100.</w:t>
-      </w:r>
-    </w:p>
-    <w:p>
-      <w:pPr>
-        <w:spacing w:before="30" w:after="10" w:line="240" w:lineRule="auto"/>
-        <w:jc w:val="left"/>
-      </w:pPr>
-      <w:r>
-        <w:rPr>
-          <w:rFonts w:ascii="Arial" w:hAnsi="Arial" w:eastAsia="Microsoft YaHei"/>
-          <w:b/>
-          <w:i w:val="0"/>
-          <w:color w:val="111827"/>
-          <w:sz w:val="17"/>
-        </w:rPr>
-        <w:t xml:space="preserve">Multimodal Deepfake Detection | </w:t>
-      </w:r>
-      <w:hyperlink r:id="rId22">
-        <w:r>
-          <w:rPr>
-            <w:rFonts w:ascii="Arial" w:hAnsi="Arial" w:eastAsia="Microsoft YaHei"/>
-            <w:sz w:val="17"/>
-          </w:rPr>
-          <w:t>github.com/theraihanrakibb/M.Eng-Thesis-Multimodal-Deepfake-Audio-Visual-Temporal-Framework</w:t>
-        </w:r>
-      </w:hyperlink>
-    </w:p>
-    <w:p>
-      <w:pPr>
-        <w:spacing w:before="0" w:after="20" w:line="240" w:lineRule="auto"/>
-        <w:ind w:left="255" w:hanging="150"/>
-        <w:jc w:val="both"/>
-      </w:pPr>
-      <w:r>
-        <w:rPr>
-          <w:rFonts w:ascii="Arial" w:hAnsi="Arial" w:eastAsia="Microsoft YaHei"/>
-          <w:b w:val="0"/>
-          <w:i w:val="0"/>
-          <w:color w:val="111827"/>
-          <w:sz w:val="17"/>
-        </w:rPr>
-        <w:t>•  M.Eng. thesis: audio-visual-temporal framework detecting deepfake video via visual, audio, and temporal inconsistency analysis.</w:t>
+        <w:t>•  Built a PyTorch distributed CLI that launches and supervises multi-node training jobs with fault detection, automatic retry, and checkpoint recovery.</w:t>
       </w:r>
     </w:p>
     <w:p>
@@ -1275,7 +1256,7 @@
                 <w:color w:val="111827"/>
                 <w:sz w:val="15"/>
               </w:rPr>
-              <w:t>Languages</w:t>
+              <w:t>LLM Inference &amp; Systems</w:t>
             </w:r>
           </w:p>
         </w:tc>
@@ -1296,7 +1277,7 @@
                 <w:color w:val="111827"/>
                 <w:sz w:val="15"/>
               </w:rPr>
-              <w:t>Python (primary) | C | C++ | Java | SQL | Bash</w:t>
+              <w:t>SGLang, vLLM, KV Cache, PD Disaggregation, Mooncake/RDMA, Continuous Batching, RadixAttention</w:t>
             </w:r>
           </w:p>
         </w:tc>
@@ -1319,7 +1300,7 @@
                 <w:color w:val="111827"/>
                 <w:sz w:val="15"/>
               </w:rPr>
-              <w:t>AI / ML</w:t>
+              <w:t>GPU &amp; Performance</w:t>
             </w:r>
           </w:p>
         </w:tc>
@@ -1340,7 +1321,7 @@
                 <w:color w:val="111827"/>
                 <w:sz w:val="15"/>
               </w:rPr>
-              <w:t>PyTorch | TensorFlow | Transformers | scikit-learn | NumPy | deep learning | model evaluation &amp; metrics</w:t>
+              <w:t>CUDA, CUDA C++, Triton, Nsight Systems, Nsight Compute, PyTorch Profiler, GEMM optimization, FP8/FP4/INT4</w:t>
             </w:r>
           </w:p>
         </w:tc>
@@ -1363,7 +1344,7 @@
                 <w:color w:val="111827"/>
                 <w:sz w:val="15"/>
               </w:rPr>
-              <w:t>LLMs &amp; serving</w:t>
+              <w:t>ML &amp; Multimodal</w:t>
             </w:r>
           </w:p>
         </w:tc>
@@ -1384,7 +1365,7 @@
                 <w:color w:val="111827"/>
                 <w:sz w:val="15"/>
               </w:rPr>
-              <w:t>LLM inference &amp; serving (SGLang, vLLM) | RAG | agents | fine-tuning (LoRA/QLoRA) | quantization (FP8/INT4)</w:t>
+              <w:t>PyTorch, Hugging Face Transformers, Diffusion/DiT, Multimodal Learning, OpenCV</w:t>
             </w:r>
           </w:p>
         </w:tc>
@@ -1407,7 +1388,7 @@
                 <w:color w:val="111827"/>
                 <w:sz w:val="15"/>
               </w:rPr>
-              <w:t>GPU &amp; systems</w:t>
+              <w:t>Distributed Systems</w:t>
             </w:r>
           </w:p>
         </w:tc>
@@ -1428,7 +1409,7 @@
                 <w:color w:val="111827"/>
                 <w:sz w:val="15"/>
               </w:rPr>
-              <w:t>CUDA | Triton | FlashAttention | multi-GPU/distributed training (DDP, FSDP) | PyTorch Profiler | Nsight</w:t>
+              <w:t>PyTorch Distributed, Docker, Kubernetes, Linux, Prometheus, CI/CD</w:t>
             </w:r>
           </w:p>
         </w:tc>
@@ -1451,7 +1432,7 @@
                 <w:color w:val="111827"/>
                 <w:sz w:val="15"/>
               </w:rPr>
-              <w:t>Computer vision &amp; generative AI</w:t>
+              <w:t>Programming</w:t>
             </w:r>
           </w:p>
         </w:tc>
@@ -1472,139 +1453,7 @@
                 <w:color w:val="111827"/>
                 <w:sz w:val="15"/>
               </w:rPr>
-              <w:t>CNNs | Vision Transformers | diffusion models (DDPM/DiT) | video generation | multimodal learning | OpenCV</w:t>
-            </w:r>
-          </w:p>
-        </w:tc>
-      </w:tr>
-      <w:tr>
-        <w:tc>
-          <w:tcPr>
-            <w:tcW w:type="dxa" w:w="2948"/>
-          </w:tcPr>
-          <w:p>
-            <w:pPr>
-              <w:spacing w:after="30" w:before="0"/>
-              <w:jc w:val="both"/>
-            </w:pPr>
-            <w:r>
-              <w:rPr>
-                <w:rFonts w:ascii="Arial" w:hAnsi="Arial" w:eastAsia="Microsoft YaHei"/>
-                <w:b/>
-                <w:i w:val="0"/>
-                <w:color w:val="111827"/>
-                <w:sz w:val="15"/>
-              </w:rPr>
-              <w:t>Data &amp; MLOps</w:t>
-            </w:r>
-          </w:p>
-        </w:tc>
-        <w:tc>
-          <w:tcPr>
-            <w:tcW w:type="dxa" w:w="7710"/>
-          </w:tcPr>
-          <w:p>
-            <w:pPr>
-              <w:spacing w:after="30" w:before="0"/>
-              <w:jc w:val="both"/>
-            </w:pPr>
-            <w:r>
-              <w:rPr>
-                <w:rFonts w:ascii="Arial" w:hAnsi="Arial" w:eastAsia="Microsoft YaHei"/>
-                <w:b w:val="0"/>
-                <w:i w:val="0"/>
-                <w:color w:val="111827"/>
-                <w:sz w:val="15"/>
-              </w:rPr>
-              <w:t>Pandas | Docker | Kubernetes | Git | CI/CD | Slurm | AWS / GCP | Apache Spark | Weights &amp; Biases / MLflow</w:t>
-            </w:r>
-          </w:p>
-        </w:tc>
-      </w:tr>
-      <w:tr>
-        <w:tc>
-          <w:tcPr>
-            <w:tcW w:type="dxa" w:w="2948"/>
-          </w:tcPr>
-          <w:p>
-            <w:pPr>
-              <w:spacing w:after="30" w:before="0"/>
-              <w:jc w:val="both"/>
-            </w:pPr>
-            <w:r>
-              <w:rPr>
-                <w:rFonts w:ascii="Arial" w:hAnsi="Arial" w:eastAsia="Microsoft YaHei"/>
-                <w:b/>
-                <w:i w:val="0"/>
-                <w:color w:val="111827"/>
-                <w:sz w:val="15"/>
-              </w:rPr>
-              <w:t>Math &amp; theory</w:t>
-            </w:r>
-          </w:p>
-        </w:tc>
-        <w:tc>
-          <w:tcPr>
-            <w:tcW w:type="dxa" w:w="7710"/>
-          </w:tcPr>
-          <w:p>
-            <w:pPr>
-              <w:spacing w:after="30" w:before="0"/>
-              <w:jc w:val="both"/>
-            </w:pPr>
-            <w:r>
-              <w:rPr>
-                <w:rFonts w:ascii="Arial" w:hAnsi="Arial" w:eastAsia="Microsoft YaHei"/>
-                <w:b w:val="0"/>
-                <w:i w:val="0"/>
-                <w:color w:val="111827"/>
-                <w:sz w:val="15"/>
-              </w:rPr>
-              <w:t>linear algebra | probability &amp; statistics | optimization | convex optimization | information theory</w:t>
-            </w:r>
-          </w:p>
-        </w:tc>
-      </w:tr>
-      <w:tr>
-        <w:tc>
-          <w:tcPr>
-            <w:tcW w:type="dxa" w:w="2948"/>
-          </w:tcPr>
-          <w:p>
-            <w:pPr>
-              <w:spacing w:after="30" w:before="0"/>
-              <w:jc w:val="both"/>
-            </w:pPr>
-            <w:r>
-              <w:rPr>
-                <w:rFonts w:ascii="Arial" w:hAnsi="Arial" w:eastAsia="Microsoft YaHei"/>
-                <w:b/>
-                <w:i w:val="0"/>
-                <w:color w:val="111827"/>
-                <w:sz w:val="15"/>
-              </w:rPr>
-              <w:t>Fundamentals</w:t>
-            </w:r>
-          </w:p>
-        </w:tc>
-        <w:tc>
-          <w:tcPr>
-            <w:tcW w:type="dxa" w:w="7710"/>
-          </w:tcPr>
-          <w:p>
-            <w:pPr>
-              <w:spacing w:after="30" w:before="0"/>
-              <w:jc w:val="both"/>
-            </w:pPr>
-            <w:r>
-              <w:rPr>
-                <w:rFonts w:ascii="Arial" w:hAnsi="Arial" w:eastAsia="Microsoft YaHei"/>
-                <w:b w:val="0"/>
-                <w:i w:val="0"/>
-                <w:color w:val="111827"/>
-                <w:sz w:val="15"/>
-              </w:rPr>
-              <w:t>data structures &amp; algorithms | concurrency | operating systems | computer networks | distributed systems</w:t>
+              <w:t>Python, C++, CUDA C++, Bash, SQL, Data Structures &amp; Algorithms</w:t>
             </w:r>
           </w:p>
         </w:tc>
@@ -1654,7 +1503,7 @@
         </w:rPr>
         <w:t xml:space="preserve">, School of Software, </w:t>
       </w:r>
-      <w:hyperlink r:id="rId15">
+      <w:hyperlink r:id="rId16">
         <w:r>
           <w:rPr>
             <w:rFonts w:ascii="Arial" w:hAnsi="Arial" w:eastAsia="Microsoft YaHei"/>
@@ -1671,7 +1520,7 @@
           <w:color w:val="111827"/>
           <w:sz w:val="15"/>
         </w:rPr>
-        <w:t xml:space="preserve"> (985/211) - Sep 2024 - Jul 2027</w:t>
+        <w:t xml:space="preserve"> - Sep 2024 - Jul 2027</w:t>
       </w:r>
     </w:p>
     <w:p>
@@ -1687,7 +1536,7 @@
           <w:color w:val="4A5568"/>
           <w:sz w:val="15"/>
         </w:rPr>
-        <w:t>GPA: 88/100 | Top 1% | Chinese Government Scholarship | President of International Student Union (ISU)</w:t>
+        <w:t>GPA: 88/100, Top 1%, Chinese Government Scholarship, President of International Student Union (ISU)</w:t>
       </w:r>
     </w:p>
     <w:p>
@@ -1715,7 +1564,7 @@
         </w:rPr>
         <w:t xml:space="preserve">, School of Computer Science, </w:t>
       </w:r>
-      <w:hyperlink r:id="rId15">
+      <w:hyperlink r:id="rId16">
         <w:r>
           <w:rPr>
             <w:rFonts w:ascii="Arial" w:hAnsi="Arial" w:eastAsia="Microsoft YaHei"/>
@@ -1732,7 +1581,7 @@
           <w:color w:val="111827"/>
           <w:sz w:val="15"/>
         </w:rPr>
-        <w:t xml:space="preserve"> (985/211) - Sep 2020 - Jul 2024</w:t>
+        <w:t xml:space="preserve"> - Sep 2020 - Jul 2024</w:t>
       </w:r>
     </w:p>
     <w:p>
@@ -1748,7 +1597,7 @@
           <w:color w:val="4A5568"/>
           <w:sz w:val="15"/>
         </w:rPr>
-        <w:t>GPA: 85/100 | Top 1% | Presidential Scholarship | Best Undergraduate Thesis Award</w:t>
+        <w:t>GPA: 85/100, Top 1%, Presidential Scholarship, Best Undergraduate Thesis Award</w:t>
       </w:r>
     </w:p>
     <w:p>
@@ -1783,7 +1632,7 @@
           <w:color w:val="111827"/>
           <w:sz w:val="15"/>
         </w:rPr>
-        <w:t>Publication:</w:t>
+        <w:t>First Author</w:t>
       </w:r>
       <w:r>
         <w:rPr>
@@ -1793,7 +1642,7 @@
           <w:color w:val="111827"/>
           <w:sz w:val="15"/>
         </w:rPr>
-        <w:t xml:space="preserve"> First Author, "NVFP4-DiT: Efficient 4-Bit Audio-Guided Video Diffusion Transformers for Low-Cost Video Generation" - IEEE Transactions on Neural Networks and Learning Systems (TNNLS, Q1), Under Review.</w:t>
+        <w:t xml:space="preserve"> — "NVFP4-DiT: Efficient 4-Bit Audio-Guided Video Diffusion Transformers for Low-Cost Video Generation" — IEEE Transactions on Neural Networks and Learning Systems (TNNLS, Q1), manuscript under review.</w:t>
       </w:r>
     </w:p>
     <w:p>
@@ -1819,9 +1668,9 @@
           <w:color w:val="111827"/>
           <w:sz w:val="15"/>
         </w:rPr>
-        <w:t xml:space="preserve"> Chinese Government Scholarship (2024-2027); Presidential Scholarship (2020-2024); Best Undergraduate Thesis Award (2024); </w:t>
+        <w:t xml:space="preserve"> Chinese Government Scholarship (2024-2027); Presidential Scholarship (2020-2024); Wu Yajun Scholarship (2024); Best Undergraduate Thesis Award (2024); </w:t>
       </w:r>
-      <w:hyperlink r:id="rId23">
+      <w:hyperlink r:id="rId21">
         <w:r>
           <w:rPr>
             <w:rFonts w:ascii="Arial" w:hAnsi="Arial" w:eastAsia="Microsoft YaHei"/>
@@ -1839,6 +1688,32 @@
           <w:sz w:val="15"/>
         </w:rPr>
         <w:t xml:space="preserve"> (2024), NWPU; Hackathon Winner - NWPU AI Challenge (2023).</w:t>
+      </w:r>
+    </w:p>
+    <w:p>
+      <w:pPr>
+        <w:spacing w:before="0" w:after="40" w:line="240" w:lineRule="auto"/>
+        <w:jc w:val="both"/>
+      </w:pPr>
+      <w:r>
+        <w:rPr>
+          <w:rFonts w:ascii="Arial" w:hAnsi="Arial" w:eastAsia="Microsoft YaHei"/>
+          <w:b/>
+          <w:i w:val="0"/>
+          <w:color w:val="111827"/>
+          <w:sz w:val="15"/>
+        </w:rPr>
+        <w:t>Certifications:</w:t>
+      </w:r>
+      <w:r>
+        <w:rPr>
+          <w:rFonts w:ascii="Arial" w:hAnsi="Arial" w:eastAsia="Microsoft YaHei"/>
+          <w:b w:val="0"/>
+          <w:i w:val="0"/>
+          <w:color w:val="111827"/>
+          <w:sz w:val="15"/>
+        </w:rPr>
+        <w:t xml:space="preserve"> AWS Certified Machine Learning – Specialty; Professional Scrum Master I (PSM I), Scrum.org; Deep Learning Specialization, DeepLearning.AI.</w:t>
       </w:r>
     </w:p>
     <w:p>
@@ -1891,7 +1766,7 @@
                 <w:color w:val="1F3864"/>
                 <w:sz w:val="16"/>
               </w:rPr>
-              <w:t>AI 工程师-大模型推理与多模态研究（2027 届应届）</w:t>
+              <w:t>ML 系统工程师 | 大模型推理与多模态 AI</w:t>
             </w:r>
           </w:p>
           <w:p>
@@ -1907,8 +1782,14 @@
                 <w:color w:val="4A5568"/>
                 <w:sz w:val="14"/>
               </w:rPr>
-              <w:t>现居：中国·西安 | 可接受异地 | 2027 年 7 月到岗</w:t>
+              <w:t>2027 届应届 · 2027 年 7 月到岗 · 可接受异地 · 中国·西安</w:t>
             </w:r>
+          </w:p>
+          <w:p>
+            <w:pPr>
+              <w:spacing w:before="0" w:after="20" w:line="240" w:lineRule="auto"/>
+              <w:jc w:val="both"/>
+            </w:pPr>
           </w:p>
           <w:p>
             <w:pPr>
@@ -1923,57 +1804,9 @@
                 <w:color w:val="4A5568"/>
                 <w:sz w:val="14"/>
               </w:rPr>
-              <w:t>国籍：孟加拉国 | 性别：男 | 出生日期：2002.12.06</w:t>
+              <w:t xml:space="preserve">邮箱: </w:t>
             </w:r>
-          </w:p>
-          <w:p>
-            <w:pPr>
-              <w:spacing w:before="0" w:after="20" w:line="240" w:lineRule="auto"/>
-              <w:jc w:val="both"/>
-            </w:pPr>
-            <w:r>
-              <w:rPr>
-                <w:rFonts w:ascii="Arial" w:hAnsi="Arial" w:eastAsia="Microsoft YaHei"/>
-                <w:b w:val="0"/>
-                <w:i w:val="0"/>
-                <w:color w:val="4A5568"/>
-                <w:sz w:val="14"/>
-              </w:rPr>
-              <w:t>语言：孟加拉语（母语）| 英语（流利）| 中文（日常交流）</w:t>
-            </w:r>
-          </w:p>
-          <w:p>
-            <w:pPr>
-              <w:spacing w:before="0" w:after="20" w:line="240" w:lineRule="auto"/>
-              <w:jc w:val="both"/>
-            </w:pPr>
-            <w:r>
-              <w:rPr>
-                <w:rFonts w:ascii="Arial" w:hAnsi="Arial" w:eastAsia="Microsoft YaHei"/>
-                <w:b w:val="0"/>
-                <w:i w:val="0"/>
-                <w:color w:val="4A5568"/>
-                <w:sz w:val="14"/>
-              </w:rPr>
-              <w:t>工作许可：需办理中国工作签证（雇主担保 Z 签证）| 全球：接受担保</w:t>
-            </w:r>
-          </w:p>
-          <w:p>
-            <w:pPr>
-              <w:spacing w:before="0" w:after="20" w:line="240" w:lineRule="auto"/>
-              <w:jc w:val="both"/>
-            </w:pPr>
-            <w:r>
-              <w:rPr>
-                <w:rFonts w:ascii="Arial" w:hAnsi="Arial" w:eastAsia="Microsoft YaHei"/>
-                <w:b w:val="0"/>
-                <w:i w:val="0"/>
-                <w:color w:val="4A5568"/>
-                <w:sz w:val="14"/>
-              </w:rPr>
-              <w:t>邮箱：</w:t>
-            </w:r>
-            <w:hyperlink r:id="rId24">
+            <w:hyperlink r:id="rId9">
               <w:r>
                 <w:rPr>
                   <w:rFonts w:ascii="Arial" w:hAnsi="Arial" w:eastAsia="Microsoft YaHei"/>
@@ -1990,15 +1823,15 @@
                 <w:color w:val="4A5568"/>
                 <w:sz w:val="14"/>
               </w:rPr>
-              <w:t xml:space="preserve"> | 电话：</w:t>
+              <w:t xml:space="preserve"> · 电话: </w:t>
             </w:r>
-            <w:hyperlink r:id="rId9">
+            <w:hyperlink r:id="rId10">
               <w:r>
                 <w:rPr>
                   <w:rFonts w:ascii="Arial" w:hAnsi="Arial" w:eastAsia="Microsoft YaHei"/>
                   <w:sz w:val="14"/>
                 </w:rPr>
-                <w:t>+86-17722362949</w:t>
+                <w:t>+86 177 2236 2949</w:t>
               </w:r>
             </w:hyperlink>
             <w:r>
@@ -2009,7 +1842,7 @@
                 <w:color w:val="4A5568"/>
                 <w:sz w:val="14"/>
               </w:rPr>
-              <w:t xml:space="preserve"> | 微信：imeddii</w:t>
+              <w:t xml:space="preserve"> · 微信: imeddii</w:t>
             </w:r>
           </w:p>
           <w:p>
@@ -2025,9 +1858,28 @@
                 <w:color w:val="4A5568"/>
                 <w:sz w:val="14"/>
               </w:rPr>
-              <w:t xml:space="preserve">LinkedIn: </w:t>
+              <w:t xml:space="preserve">&lt;font name="Times-Roman"&gt;GitHub: </w:t>
             </w:r>
-            <w:hyperlink r:id="rId10">
+            <w:hyperlink r:id="rId11">
+              <w:r>
+                <w:rPr>
+                  <w:rFonts w:ascii="Arial" w:hAnsi="Arial" w:eastAsia="Microsoft YaHei"/>
+                  <w:sz w:val="14"/>
+                </w:rPr>
+                <w:t>github.com/theraihanrakibb</w:t>
+              </w:r>
+            </w:hyperlink>
+            <w:r>
+              <w:rPr>
+                <w:rFonts w:ascii="Arial" w:hAnsi="Arial" w:eastAsia="Microsoft YaHei"/>
+                <w:b w:val="0"/>
+                <w:i w:val="0"/>
+                <w:color w:val="4A5568"/>
+                <w:sz w:val="14"/>
+              </w:rPr>
+              <w:t xml:space="preserve"> · LinkedIn: </w:t>
+            </w:r>
+            <w:hyperlink r:id="rId12">
               <w:r>
                 <w:rPr>
                   <w:rFonts w:ascii="Arial" w:hAnsi="Arial" w:eastAsia="Microsoft YaHei"/>
@@ -2044,23 +1896,17 @@
                 <w:color w:val="4A5568"/>
                 <w:sz w:val="14"/>
               </w:rPr>
-              <w:t xml:space="preserve"> | GitHub: </w:t>
+              <w:t xml:space="preserve"> · Portfolio: </w:t>
             </w:r>
-            <w:hyperlink r:id="rId11">
+            <w:hyperlink r:id="rId13">
               <w:r>
                 <w:rPr>
                   <w:rFonts w:ascii="Arial" w:hAnsi="Arial" w:eastAsia="Microsoft YaHei"/>
                   <w:sz w:val="14"/>
                 </w:rPr>
-                <w:t>github.com/theraihanrakibb</w:t>
+                <w:t>theraihanrakibb.github.io</w:t>
               </w:r>
             </w:hyperlink>
-          </w:p>
-          <w:p>
-            <w:pPr>
-              <w:spacing w:before="0" w:after="20" w:line="240" w:lineRule="auto"/>
-              <w:jc w:val="both"/>
-            </w:pPr>
             <w:r>
               <w:rPr>
                 <w:rFonts w:ascii="Arial" w:hAnsi="Arial" w:eastAsia="Microsoft YaHei"/>
@@ -2069,17 +1915,8 @@
                 <w:color w:val="4A5568"/>
                 <w:sz w:val="14"/>
               </w:rPr>
-              <w:t xml:space="preserve">作品集: </w:t>
+              <w:t>&lt;/font&gt;</w:t>
             </w:r>
-            <w:hyperlink r:id="rId12">
-              <w:r>
-                <w:rPr>
-                  <w:rFonts w:ascii="Arial" w:hAnsi="Arial" w:eastAsia="Microsoft YaHei"/>
-                  <w:sz w:val="14"/>
-                </w:rPr>
-                <w:t>theraihanrakibb.github.io</w:t>
-              </w:r>
-            </w:hyperlink>
           </w:p>
         </w:tc>
         <w:tc>
@@ -2107,7 +1944,7 @@
                           <pic:cNvPicPr/>
                         </pic:nvPicPr>
                         <pic:blipFill>
-                          <a:blip r:embed="rId13"/>
+                          <a:blip r:embed="rId14"/>
                           <a:stretch>
                             <a:fillRect/>
                           </a:stretch>
@@ -2168,47 +2005,7 @@
           <w:color w:val="111827"/>
           <w:sz w:val="15"/>
         </w:rPr>
-        <w:t xml:space="preserve">2027 届应届 AI 工程师，专注大模型推理系统与多模态研究。在 </w:t>
-      </w:r>
-      <w:r>
-        <w:rPr>
-          <w:rFonts w:ascii="Arial" w:hAnsi="Arial" w:eastAsia="Microsoft YaHei"/>
-          <w:b/>
-          <w:i w:val="0"/>
-          <w:color w:val="111827"/>
-          <w:sz w:val="15"/>
-        </w:rPr>
-        <w:t>InfiX.ai</w:t>
-      </w:r>
-      <w:r>
-        <w:rPr>
-          <w:rFonts w:ascii="Arial" w:hAnsi="Arial" w:eastAsia="Microsoft YaHei"/>
-          <w:b w:val="0"/>
-          <w:i w:val="0"/>
-          <w:color w:val="111827"/>
-          <w:sz w:val="15"/>
-        </w:rPr>
-        <w:t xml:space="preserve"> 的 </w:t>
-      </w:r>
-      <w:r>
-        <w:rPr>
-          <w:rFonts w:ascii="Arial" w:hAnsi="Arial" w:eastAsia="Microsoft YaHei"/>
-          <w:b/>
-          <w:i w:val="0"/>
-          <w:color w:val="111827"/>
-          <w:sz w:val="15"/>
-        </w:rPr>
-        <w:t>4x A800</w:t>
-      </w:r>
-      <w:r>
-        <w:rPr>
-          <w:rFonts w:ascii="Arial" w:hAnsi="Arial" w:eastAsia="Microsoft YaHei"/>
-          <w:b w:val="0"/>
-          <w:i w:val="0"/>
-          <w:color w:val="111827"/>
-          <w:sz w:val="15"/>
-        </w:rPr>
-        <w:t xml:space="preserve"> 集群上构建并部署大模型服务（SGLang、KV-cache 卸载、PD 分离——缓存命中率 92.27%，TTFT 降低 8.3 倍）。IEEE TNNLS（Q1）论文第一作者。求职方向：AI 工程师 / 算法研究员，地点中国、香港或全球。</w:t>
+        <w:t>ML 系统工程师，专注大模型推理、GPU 优化与多模态生成式 AI。在 InfiX.ai 实习期间，优化生产级大模型服务——Qwen 部署于 4× A800、DeepSeek 部署于 H200 多节点集群——通过三级 KV-cache 卸载将长上下文 TTFT 降低 8.3×（55s→6.7s），并借助基于 RDMA 的 prefill/decode 分离将稳定并发由 192→ 256 提升。作为第一作者撰写 IEEE TNNLS 论文，研究 NVFP4 4 比特音频引导视频扩散，在 H100 上实现显存降低 4×。擅长 SGLang、CUDA/Triton、低精度推理与分布式系统。</w:t>
       </w:r>
     </w:p>
     <w:p>
@@ -2245,7 +2042,7 @@
         </w:rPr>
         <w:t>无界智索（深圳）科技（</w:t>
       </w:r>
-      <w:hyperlink r:id="rId14">
+      <w:hyperlink r:id="rId15">
         <w:r>
           <w:rPr>
             <w:rFonts w:ascii="Arial" w:hAnsi="Arial" w:eastAsia="Microsoft YaHei"/>
@@ -2262,7 +2059,7 @@
           <w:color w:val="111827"/>
           <w:sz w:val="16"/>
         </w:rPr>
-        <w:t>）| AI 基础设施工程师实习 | 深圳 | 2026年4月 - 2026年6月</w:t>
+        <w:t>）, AI 基础设施工程师实习, 深圳, 2026年4月 - 2026年6月</w:t>
       </w:r>
     </w:p>
     <w:p>
@@ -2279,7 +2076,27 @@
           <w:color w:val="111827"/>
           <w:sz w:val="15"/>
         </w:rPr>
-        <w:t>•  通过 Mooncake RDMA 在 4x A800 上构建三级 KV-cache 卸载（GPU HBM -&gt; CPU DRAM -&gt; SSD），将 TTFT 降低 8.3 倍（55s -&gt; 6.7s），长上下文模型缓存命中率达 92.27%。</w:t>
+        <w:t xml:space="preserve">•  在 4× A800-80GB 上基于 Mooncake RDMA 设计并实现三级 KV-cache 卸载系统（GPU HBM → CPU DRAM → SSD），服务 Qwen3.5/3.6-27B 时将长上下文（32K+ token）首字延迟（TTFT）降低 8.3×（55s→6.7s），缓存命中率维持 </w:t>
+      </w:r>
+      <w:r>
+        <w:rPr>
+          <w:rFonts w:ascii="Arial" w:hAnsi="Arial" w:eastAsia="Microsoft YaHei"/>
+          <w:b/>
+          <w:i w:val="0"/>
+          <w:color w:val="111827"/>
+          <w:sz w:val="15"/>
+        </w:rPr>
+        <w:t>92%</w:t>
+      </w:r>
+      <w:r>
+        <w:rPr>
+          <w:rFonts w:ascii="Arial" w:hAnsi="Arial" w:eastAsia="Microsoft YaHei"/>
+          <w:b w:val="0"/>
+          <w:i w:val="0"/>
+          <w:color w:val="111827"/>
+          <w:sz w:val="15"/>
+        </w:rPr>
+        <w:t>。</w:t>
       </w:r>
     </w:p>
     <w:p>
@@ -2296,7 +2113,7 @@
           <w:color w:val="111827"/>
           <w:sz w:val="15"/>
         </w:rPr>
-        <w:t>•  修改 SGLang 源码的缓存管理与内存分配模块（kvcacheio.py、hiradix_cache.py、memory_pool_host.py），修复生产缓存故障并部署混合注意力 Qwen 模型。</w:t>
+        <w:t>•  通过基于 RDMA 的 KV 传输实现 2+2 GPU prefill/decode 分离，结合 RadixAttention 前缀缓存与连续批处理，将 Qwen3.6-27B 的稳定服务并发提升 33%（192→ 256 请求）。</w:t>
       </w:r>
     </w:p>
     <w:p>
@@ -2313,7 +2130,127 @@
           <w:color w:val="111827"/>
           <w:sz w:val="15"/>
         </w:rPr>
-        <w:t>•  构建 PD 分离（prefill/decode）推理架构，基于 RDMA 共享 KV，稳定并发由 192 -&gt; 256 提升，并通过 RadixAttention 前缀缓存与连续批处理提高 GPU 利用率。</w:t>
+        <w:t xml:space="preserve">•  修改 </w:t>
+      </w:r>
+      <w:r>
+        <w:rPr>
+          <w:rFonts w:ascii="Arial" w:hAnsi="Arial" w:eastAsia="Microsoft YaHei"/>
+          <w:b/>
+          <w:i w:val="0"/>
+          <w:color w:val="111827"/>
+          <w:sz w:val="15"/>
+        </w:rPr>
+        <w:t>SGLang</w:t>
+      </w:r>
+      <w:r>
+        <w:rPr>
+          <w:rFonts w:ascii="Arial" w:hAnsi="Arial" w:eastAsia="Microsoft YaHei"/>
+          <w:b w:val="0"/>
+          <w:i w:val="0"/>
+          <w:color w:val="111827"/>
+          <w:sz w:val="15"/>
+        </w:rPr>
+        <w:t xml:space="preserve"> 缓存管理与内存分配内部模块（</w:t>
+      </w:r>
+      <w:r>
+        <w:rPr>
+          <w:rFonts w:ascii="Arial" w:hAnsi="Arial" w:eastAsia="Microsoft YaHei"/>
+          <w:b w:val="0"/>
+          <w:i/>
+          <w:color w:val="111827"/>
+          <w:sz w:val="15"/>
+        </w:rPr>
+        <w:t>kvcacheio.py</w:t>
+      </w:r>
+      <w:r>
+        <w:rPr>
+          <w:rFonts w:ascii="Arial" w:hAnsi="Arial" w:eastAsia="Microsoft YaHei"/>
+          <w:b w:val="0"/>
+          <w:i w:val="0"/>
+          <w:color w:val="111827"/>
+          <w:sz w:val="15"/>
+        </w:rPr>
+        <w:t>、</w:t>
+      </w:r>
+      <w:r>
+        <w:rPr>
+          <w:rFonts w:ascii="Arial" w:hAnsi="Arial" w:eastAsia="Microsoft YaHei"/>
+          <w:b w:val="0"/>
+          <w:i/>
+          <w:color w:val="111827"/>
+          <w:sz w:val="15"/>
+        </w:rPr>
+        <w:t>memory_pool_host.py</w:t>
+      </w:r>
+      <w:r>
+        <w:rPr>
+          <w:rFonts w:ascii="Arial" w:hAnsi="Arial" w:eastAsia="Microsoft YaHei"/>
+          <w:b w:val="0"/>
+          <w:i w:val="0"/>
+          <w:color w:val="111827"/>
+          <w:sz w:val="15"/>
+        </w:rPr>
+        <w:t>、</w:t>
+      </w:r>
+      <w:r>
+        <w:rPr>
+          <w:rFonts w:ascii="Arial" w:hAnsi="Arial" w:eastAsia="Microsoft YaHei"/>
+          <w:b w:val="0"/>
+          <w:i/>
+          <w:color w:val="111827"/>
+          <w:sz w:val="15"/>
+        </w:rPr>
+        <w:t>hi_mamba_radix_cache.py</w:t>
+      </w:r>
+      <w:r>
+        <w:rPr>
+          <w:rFonts w:ascii="Arial" w:hAnsi="Arial" w:eastAsia="Microsoft YaHei"/>
+          <w:b w:val="0"/>
+          <w:i w:val="0"/>
+          <w:color w:val="111827"/>
+          <w:sz w:val="15"/>
+        </w:rPr>
+        <w:t xml:space="preserve">）——覆盖 </w:t>
+      </w:r>
+      <w:r>
+        <w:rPr>
+          <w:rFonts w:ascii="Arial" w:hAnsi="Arial" w:eastAsia="Microsoft YaHei"/>
+          <w:b/>
+          <w:i w:val="0"/>
+          <w:color w:val="111827"/>
+          <w:sz w:val="15"/>
+        </w:rPr>
+        <w:t>v0.5.9</w:t>
+      </w:r>
+      <w:r>
+        <w:rPr>
+          <w:rFonts w:ascii="Arial" w:hAnsi="Arial" w:eastAsia="Microsoft YaHei"/>
+          <w:b w:val="0"/>
+          <w:i w:val="0"/>
+          <w:color w:val="111827"/>
+          <w:sz w:val="15"/>
+        </w:rPr>
+        <w:t xml:space="preserve">（A800）与 </w:t>
+      </w:r>
+      <w:r>
+        <w:rPr>
+          <w:rFonts w:ascii="Arial" w:hAnsi="Arial" w:eastAsia="Microsoft YaHei"/>
+          <w:b/>
+          <w:i w:val="0"/>
+          <w:color w:val="111827"/>
+          <w:sz w:val="15"/>
+        </w:rPr>
+        <w:t>v0.5.10-post2</w:t>
+      </w:r>
+      <w:r>
+        <w:rPr>
+          <w:rFonts w:ascii="Arial" w:hAnsi="Arial" w:eastAsia="Microsoft YaHei"/>
+          <w:b w:val="0"/>
+          <w:i w:val="0"/>
+          <w:color w:val="111827"/>
+          <w:sz w:val="15"/>
+        </w:rPr>
+        <w:t xml:space="preserve"> 容器镜像（H200）——修复生产缓存故障并支持混合注意力（Mamba + 全注意力）Qwen 模型。</w:t>
       </w:r>
     </w:p>
     <w:p>
@@ -2330,7 +2267,47 @@
           <w:color w:val="111827"/>
           <w:sz w:val="15"/>
         </w:rPr>
-        <w:t>•  使用 Nsight Systems 分析 CUDA/Triton 推理链路，定位 GEMM 瓶颈，经算子优化与 FP8 量化提升服务吞吐。</w:t>
+        <w:t xml:space="preserve">•  使用 </w:t>
+      </w:r>
+      <w:r>
+        <w:rPr>
+          <w:rFonts w:ascii="Arial" w:hAnsi="Arial" w:eastAsia="Microsoft YaHei"/>
+          <w:b/>
+          <w:i w:val="0"/>
+          <w:color w:val="111827"/>
+          <w:sz w:val="15"/>
+        </w:rPr>
+        <w:t>Nsight Systems</w:t>
+      </w:r>
+      <w:r>
+        <w:rPr>
+          <w:rFonts w:ascii="Arial" w:hAnsi="Arial" w:eastAsia="Microsoft YaHei"/>
+          <w:b w:val="0"/>
+          <w:i w:val="0"/>
+          <w:color w:val="111827"/>
+          <w:sz w:val="15"/>
+        </w:rPr>
+        <w:t xml:space="preserve"> 分析 CUDA/Triton 推理：GEMM 占单步耗时 </w:t>
+      </w:r>
+      <w:r>
+        <w:rPr>
+          <w:rFonts w:ascii="Arial" w:hAnsi="Arial" w:eastAsia="Microsoft YaHei"/>
+          <w:b/>
+          <w:i w:val="0"/>
+          <w:color w:val="111827"/>
+          <w:sz w:val="15"/>
+        </w:rPr>
+        <w:t>60%</w:t>
+      </w:r>
+      <w:r>
+        <w:rPr>
+          <w:rFonts w:ascii="Arial" w:hAnsi="Arial" w:eastAsia="Microsoft YaHei"/>
+          <w:b w:val="0"/>
+          <w:i w:val="0"/>
+          <w:color w:val="111827"/>
+          <w:sz w:val="15"/>
+        </w:rPr>
+        <w:t>，由此将优化重心从缓存 I/O 转向计算算子；FP8 KV cache 将单 token KV 显存减半（72.9 → 36.5 KB）。</w:t>
       </w:r>
     </w:p>
     <w:p>
@@ -2347,15 +2324,18 @@
           <w:color w:val="111827"/>
           <w:sz w:val="15"/>
         </w:rPr>
-        <w:t>•  运用 Little's Law 建模容量上限，论证 4x A800-80GB 上长上下文服务受限于约 1.5 RPS，指导扩容。</w:t>
+        <w:t>•  在 2× H200 部署 Qwen3-235B-A22B-FP8（235B MoE），并在 8× H200 上对 DeepSeek-V3.2（FP8）基准测试：</w:t>
       </w:r>
-    </w:p>
-    <w:p>
-      <w:pPr>
-        <w:spacing w:before="0" w:after="12" w:line="240" w:lineRule="auto"/>
-        <w:ind w:left="255" w:hanging="150"/>
-        <w:jc w:val="both"/>
-      </w:pPr>
+      <w:r>
+        <w:rPr>
+          <w:rFonts w:ascii="Arial" w:hAnsi="Arial" w:eastAsia="Microsoft YaHei"/>
+          <w:b/>
+          <w:i w:val="0"/>
+          <w:color w:val="111827"/>
+          <w:sz w:val="15"/>
+        </w:rPr>
+        <w:t>91 ms TTFT / 36 ms TPOT</w:t>
+      </w:r>
       <w:r>
         <w:rPr>
           <w:rFonts w:ascii="Arial" w:hAnsi="Arial" w:eastAsia="Microsoft YaHei"/>
@@ -2364,15 +2344,18 @@
           <w:color w:val="111827"/>
           <w:sz w:val="15"/>
         </w:rPr>
-        <w:t>•  排查并解决 12+ 起生产故障（RDMA、etcd、网络、存储与分布式推理）。</w:t>
+        <w:t>（32-64 并发）、</w:t>
       </w:r>
-    </w:p>
-    <w:p>
-      <w:pPr>
-        <w:spacing w:before="0" w:after="12" w:line="240" w:lineRule="auto"/>
-        <w:ind w:left="255" w:hanging="150"/>
-        <w:jc w:val="both"/>
-      </w:pPr>
+      <w:r>
+        <w:rPr>
+          <w:rFonts w:ascii="Arial" w:hAnsi="Arial" w:eastAsia="Microsoft YaHei"/>
+          <w:b/>
+          <w:i w:val="0"/>
+          <w:color w:val="111827"/>
+          <w:sz w:val="15"/>
+        </w:rPr>
+        <w:t>13.16 req/s</w:t>
+      </w:r>
       <w:r>
         <w:rPr>
           <w:rFonts w:ascii="Arial" w:hAnsi="Arial" w:eastAsia="Microsoft YaHei"/>
@@ -2381,7 +2364,7 @@
           <w:color w:val="111827"/>
           <w:sz w:val="15"/>
         </w:rPr>
-        <w:t>•  在 A800 集群部署 Qwen 模型（单节点 TP2，以及 TP4 PD prefill/decode 分离），并在 H800 多节点集群（每集群 8 卡）运行 DeepSeek，调优张量并行布局以提升吞吐与稳定性。</w:t>
+        <w:t>（256 并发）。</w:t>
       </w:r>
     </w:p>
     <w:p>
@@ -2416,9 +2399,9 @@
           <w:color w:val="111827"/>
           <w:sz w:val="16"/>
         </w:rPr>
-        <w:t xml:space="preserve">研究生研究员 | </w:t>
+        <w:t xml:space="preserve">研究生研究员, </w:t>
       </w:r>
-      <w:hyperlink r:id="rId15">
+      <w:hyperlink r:id="rId16">
         <w:r>
           <w:rPr>
             <w:rFonts w:ascii="Arial" w:hAnsi="Arial" w:eastAsia="Microsoft YaHei"/>
@@ -2435,7 +2418,7 @@
           <w:color w:val="111827"/>
           <w:sz w:val="16"/>
         </w:rPr>
-        <w:t xml:space="preserve"> | 2024年9月 - 至今</w:t>
+        <w:t>, 2024年9月 - 至今</w:t>
       </w:r>
     </w:p>
     <w:p>
@@ -2453,7 +2436,7 @@
         </w:rPr>
         <w:t>导师：</w:t>
       </w:r>
-      <w:hyperlink r:id="rId16">
+      <w:hyperlink r:id="rId17">
         <w:r>
           <w:rPr>
             <w:rFonts w:ascii="Arial" w:hAnsi="Arial" w:eastAsia="Microsoft YaHei"/>
@@ -2527,7 +2510,47 @@
           <w:color w:val="111827"/>
           <w:sz w:val="15"/>
         </w:rPr>
-        <w:t>，显存</w:t>
+        <w:t xml:space="preserve">，自研 FP4 打包 </w:t>
+      </w:r>
+      <w:r>
+        <w:rPr>
+          <w:rFonts w:ascii="Arial" w:hAnsi="Arial" w:eastAsia="Microsoft YaHei"/>
+          <w:b/>
+          <w:i w:val="0"/>
+          <w:color w:val="111827"/>
+          <w:sz w:val="15"/>
+        </w:rPr>
+        <w:t>Triton</w:t>
+      </w:r>
+      <w:r>
+        <w:rPr>
+          <w:rFonts w:ascii="Arial" w:hAnsi="Arial" w:eastAsia="Microsoft YaHei"/>
+          <w:b w:val="0"/>
+          <w:i w:val="0"/>
+          <w:color w:val="111827"/>
+          <w:sz w:val="15"/>
+        </w:rPr>
+        <w:t xml:space="preserve"> 算子相较 FP16 提速 </w:t>
+      </w:r>
+      <w:r>
+        <w:rPr>
+          <w:rFonts w:ascii="Arial" w:hAnsi="Arial" w:eastAsia="Microsoft YaHei"/>
+          <w:b/>
+          <w:i w:val="0"/>
+          <w:color w:val="111827"/>
+          <w:sz w:val="15"/>
+        </w:rPr>
+        <w:t>3.2 倍</w:t>
+      </w:r>
+      <w:r>
+        <w:rPr>
+          <w:rFonts w:ascii="Arial" w:hAnsi="Arial" w:eastAsia="Microsoft YaHei"/>
+          <w:b w:val="0"/>
+          <w:i w:val="0"/>
+          <w:color w:val="111827"/>
+          <w:sz w:val="15"/>
+        </w:rPr>
+        <w:t>（相较朴素 FP4 提速 2.1 倍），显存</w:t>
       </w:r>
       <w:r>
         <w:rPr>
@@ -2547,7 +2570,7 @@
           <w:color w:val="111827"/>
           <w:sz w:val="15"/>
         </w:rPr>
-        <w:t>且保持生成质量。</w:t>
+        <w:t>，生成质量具有竞争力。</w:t>
       </w:r>
     </w:p>
     <w:p>
@@ -2564,7 +2587,7 @@
           <w:color w:val="111827"/>
           <w:sz w:val="15"/>
         </w:rPr>
-        <w:t>•  实现多模态扩散 Transformer 的</w:t>
+        <w:t xml:space="preserve">•  实现自适应分块 </w:t>
       </w:r>
       <w:r>
         <w:rPr>
@@ -2574,7 +2597,7 @@
           <w:color w:val="111827"/>
           <w:sz w:val="15"/>
         </w:rPr>
-        <w:t>低精度量化（FP8/FP4/NVFP4）</w:t>
+        <w:t>FP8/FP4/NVFP4</w:t>
       </w:r>
       <w:r>
         <w:rPr>
@@ -2584,7 +2607,7 @@
           <w:color w:val="111827"/>
           <w:sz w:val="15"/>
         </w:rPr>
-        <w:t>，评估质量-效率权衡。</w:t>
+        <w:t xml:space="preserve"> 量化与量化感知训练（跨模态注意力可学习 per-head 缩放），并在 WebVid-10M、VGGSound 与 UCF-101 上评估质量-效率权衡。</w:t>
       </w:r>
     </w:p>
     <w:p>
@@ -2601,7 +2624,7 @@
           <w:color w:val="111827"/>
           <w:sz w:val="15"/>
         </w:rPr>
-        <w:t xml:space="preserve">•  在 </w:t>
+        <w:t xml:space="preserve">•  构建 </w:t>
       </w:r>
       <w:r>
         <w:rPr>
@@ -2611,7 +2634,7 @@
           <w:color w:val="111827"/>
           <w:sz w:val="15"/>
         </w:rPr>
-        <w:t>A800/H100</w:t>
+        <w:t>vLLM 风格的服务调度器</w:t>
       </w:r>
       <w:r>
         <w:rPr>
@@ -2621,7 +2644,27 @@
           <w:color w:val="111827"/>
           <w:sz w:val="15"/>
         </w:rPr>
-        <w:t xml:space="preserve"> 上对 NVFP4-DiT 进行基准测试，使用 PyTorch Profiler 与 Nsight 分析端到端延迟与显存，指导低精度算子选型。</w:t>
+        <w:t xml:space="preserve">（帧级分页注意力、动态帧批处理），并在 </w:t>
+      </w:r>
+      <w:r>
+        <w:rPr>
+          <w:rFonts w:ascii="Arial" w:hAnsi="Arial" w:eastAsia="Microsoft YaHei"/>
+          <w:b/>
+          <w:i w:val="0"/>
+          <w:color w:val="111827"/>
+          <w:sz w:val="15"/>
+        </w:rPr>
+        <w:t>H100</w:t>
+      </w:r>
+      <w:r>
+        <w:rPr>
+          <w:rFonts w:ascii="Arial" w:hAnsi="Arial" w:eastAsia="Microsoft YaHei"/>
+          <w:b w:val="0"/>
+          <w:i w:val="0"/>
+          <w:color w:val="111827"/>
+          <w:sz w:val="15"/>
+        </w:rPr>
+        <w:t xml:space="preserve"> 上使用 PyTorch Profiler 与 Nsight 进行基准测试，指导低精度算子选型。</w:t>
       </w:r>
     </w:p>
     <w:p>
@@ -2671,9 +2714,9 @@
           <w:color w:val="111827"/>
           <w:sz w:val="16"/>
         </w:rPr>
-        <w:t xml:space="preserve">本科研究员 | </w:t>
+        <w:t xml:space="preserve">本科研究员, </w:t>
       </w:r>
-      <w:hyperlink r:id="rId15">
+      <w:hyperlink r:id="rId16">
         <w:r>
           <w:rPr>
             <w:rFonts w:ascii="Arial" w:hAnsi="Arial" w:eastAsia="Microsoft YaHei"/>
@@ -2690,7 +2733,7 @@
           <w:color w:val="111827"/>
           <w:sz w:val="16"/>
         </w:rPr>
-        <w:t xml:space="preserve"> | 2023年1月 - 2024年7月</w:t>
+        <w:t>, 2023年1月 - 2024年7月</w:t>
       </w:r>
     </w:p>
     <w:p>
@@ -2708,7 +2751,7 @@
         </w:rPr>
         <w:t>导师：</w:t>
       </w:r>
-      <w:hyperlink r:id="rId17">
+      <w:hyperlink r:id="rId18">
         <w:r>
           <w:rPr>
             <w:rFonts w:ascii="Arial" w:hAnsi="Arial" w:eastAsia="Microsoft YaHei"/>
@@ -2742,7 +2785,27 @@
           <w:color w:val="111827"/>
           <w:sz w:val="15"/>
         </w:rPr>
-        <w:t>•  基于 Apache Spark 与 CKKS 同态加密设计并实现分布式机密查询框架，通过优化分析管线实现</w:t>
+        <w:t xml:space="preserve">•  基于 Apache Spark 与 CKKS 同态加密设计并实现分布式机密查询框架，在 </w:t>
+      </w:r>
+      <w:r>
+        <w:rPr>
+          <w:rFonts w:ascii="Arial" w:hAnsi="Arial" w:eastAsia="Microsoft YaHei"/>
+          <w:b/>
+          <w:i w:val="0"/>
+          <w:color w:val="111827"/>
+          <w:sz w:val="15"/>
+        </w:rPr>
+        <w:t>10 节点集群</w:t>
+      </w:r>
+      <w:r>
+        <w:rPr>
+          <w:rFonts w:ascii="Arial" w:hAnsi="Arial" w:eastAsia="Microsoft YaHei"/>
+          <w:b w:val="0"/>
+          <w:i w:val="0"/>
+          <w:color w:val="111827"/>
+          <w:sz w:val="15"/>
+        </w:rPr>
+        <w:t>上验证，通过优化分析管线实现</w:t>
       </w:r>
       <w:r>
         <w:rPr>
@@ -2834,9 +2897,9 @@
           <w:color w:val="111827"/>
           <w:sz w:val="16"/>
         </w:rPr>
-        <w:t xml:space="preserve">AI 基础设施代码集 | </w:t>
+        <w:t xml:space="preserve">AI 基础设施代码集, </w:t>
       </w:r>
-      <w:hyperlink r:id="rId18">
+      <w:hyperlink r:id="rId19">
         <w:r>
           <w:rPr>
             <w:rFonts w:ascii="Arial" w:hAnsi="Arial" w:eastAsia="Microsoft YaHei"/>
@@ -2860,7 +2923,7 @@
           <w:color w:val="111827"/>
           <w:sz w:val="15"/>
         </w:rPr>
-        <w:t>•  10 个生产级、Docker 化的 AI 基础设施项目：LLM 网关、模型服务、GPU 可观测性、训练运维、MLOps 注册表、KV-cache 模拟器、基准测试、量化、链路追踪、RAG。</w:t>
+        <w:t>•  设计并交付 10 个 Docker 化的 AI 基础设施服务——LLM 网关、模型服务、GPU 可观测性、KV-cache 模拟、基准测试、量化、链路追踪与 RAG，均配备 CI 与可复现的上手流程。</w:t>
       </w:r>
     </w:p>
     <w:p>
@@ -2876,9 +2939,9 @@
           <w:color w:val="111827"/>
           <w:sz w:val="16"/>
         </w:rPr>
-        <w:t xml:space="preserve">分布式训练启动器 | </w:t>
+        <w:t xml:space="preserve">分布式训练启动器, </w:t>
       </w:r>
-      <w:hyperlink r:id="rId19">
+      <w:hyperlink r:id="rId20">
         <w:r>
           <w:rPr>
             <w:rFonts w:ascii="Arial" w:hAnsi="Arial" w:eastAsia="Microsoft YaHei"/>
@@ -2902,133 +2965,7 @@
           <w:color w:val="111827"/>
           <w:sz w:val="15"/>
         </w:rPr>
-        <w:t>•  用于启动与监控多节点 PyTorch 训练任务的命令行工具，具备容错与自动重试；降低分布式训练运维成本。</w:t>
-      </w:r>
-    </w:p>
-    <w:p>
-      <w:pPr>
-        <w:spacing w:before="30" w:after="10" w:line="240" w:lineRule="auto"/>
-        <w:jc w:val="left"/>
-      </w:pPr>
-      <w:r>
-        <w:rPr>
-          <w:rFonts w:ascii="Arial" w:hAnsi="Arial" w:eastAsia="Microsoft YaHei"/>
-          <w:b/>
-          <w:i w:val="0"/>
-          <w:color w:val="111827"/>
-          <w:sz w:val="16"/>
-        </w:rPr>
-        <w:t xml:space="preserve">C 编译器（前端） | </w:t>
-      </w:r>
-      <w:hyperlink r:id="rId20">
-        <w:r>
-          <w:rPr>
-            <w:rFonts w:ascii="Arial" w:hAnsi="Arial" w:eastAsia="Microsoft YaHei"/>
-            <w:sz w:val="16"/>
-          </w:rPr>
-          <w:t>github.com/theraihanrakibb/c-compiler-frontend</w:t>
-        </w:r>
-      </w:hyperlink>
-    </w:p>
-    <w:p>
-      <w:pPr>
-        <w:spacing w:before="0" w:after="12" w:line="240" w:lineRule="auto"/>
-        <w:ind w:left="255" w:hanging="150"/>
-        <w:jc w:val="both"/>
-      </w:pPr>
-      <w:r>
-        <w:rPr>
-          <w:rFonts w:ascii="Arial" w:hAnsi="Arial" w:eastAsia="Microsoft YaHei"/>
-          <w:b w:val="0"/>
-          <w:i w:val="0"/>
-          <w:color w:val="111827"/>
-          <w:sz w:val="15"/>
-        </w:rPr>
-        <w:t>•  基于 Yacc/Lex 的自研 C 编译器前端（词法/语法分析/代码生成）；体现系统与算法基础。</w:t>
-      </w:r>
-    </w:p>
-    <w:p>
-      <w:pPr>
-        <w:spacing w:before="30" w:after="10" w:line="240" w:lineRule="auto"/>
-        <w:jc w:val="left"/>
-      </w:pPr>
-      <w:r>
-        <w:rPr>
-          <w:rFonts w:ascii="Arial" w:hAnsi="Arial" w:eastAsia="Microsoft YaHei"/>
-          <w:b/>
-          <w:i w:val="0"/>
-          <w:color w:val="111827"/>
-          <w:sz w:val="16"/>
-        </w:rPr>
-        <w:t xml:space="preserve">NVFP4-DiT（多模态生成） | </w:t>
-      </w:r>
-      <w:hyperlink r:id="rId21">
-        <w:r>
-          <w:rPr>
-            <w:rFonts w:ascii="Arial" w:hAnsi="Arial" w:eastAsia="Microsoft YaHei"/>
-            <w:sz w:val="16"/>
-          </w:rPr>
-          <w:t>github.com/theraihanrakibb/NVFP4-DiT</w:t>
-        </w:r>
-      </w:hyperlink>
-    </w:p>
-    <w:p>
-      <w:pPr>
-        <w:spacing w:before="0" w:after="12" w:line="240" w:lineRule="auto"/>
-        <w:ind w:left="255" w:hanging="150"/>
-        <w:jc w:val="both"/>
-      </w:pPr>
-      <w:r>
-        <w:rPr>
-          <w:rFonts w:ascii="Arial" w:hAnsi="Arial" w:eastAsia="Microsoft YaHei"/>
-          <w:b w:val="0"/>
-          <w:i w:val="0"/>
-          <w:color w:val="111827"/>
-          <w:sz w:val="15"/>
-        </w:rPr>
-        <w:t>•  第一作者 IEEE TNNLS（Q1，审稿中）4 比特音频引导视频扩散 Transformer；在 A800/H100 上显存降低 4 倍且保持生成质量。</w:t>
-      </w:r>
-    </w:p>
-    <w:p>
-      <w:pPr>
-        <w:spacing w:before="30" w:after="10" w:line="240" w:lineRule="auto"/>
-        <w:jc w:val="left"/>
-      </w:pPr>
-      <w:r>
-        <w:rPr>
-          <w:rFonts w:ascii="Arial" w:hAnsi="Arial" w:eastAsia="Microsoft YaHei"/>
-          <w:b/>
-          <w:i w:val="0"/>
-          <w:color w:val="111827"/>
-          <w:sz w:val="16"/>
-        </w:rPr>
-        <w:t xml:space="preserve">多模态深度伪造检测 | </w:t>
-      </w:r>
-      <w:hyperlink r:id="rId22">
-        <w:r>
-          <w:rPr>
-            <w:rFonts w:ascii="Arial" w:hAnsi="Arial" w:eastAsia="Microsoft YaHei"/>
-            <w:sz w:val="16"/>
-          </w:rPr>
-          <w:t>github.com/theraihanrakibb/M.Eng-Thesis-Multimodal-Deepfake-Audio-Visual-Temporal-Framework</w:t>
-        </w:r>
-      </w:hyperlink>
-    </w:p>
-    <w:p>
-      <w:pPr>
-        <w:spacing w:before="0" w:after="12" w:line="240" w:lineRule="auto"/>
-        <w:ind w:left="255" w:hanging="150"/>
-        <w:jc w:val="both"/>
-      </w:pPr>
-      <w:r>
-        <w:rPr>
-          <w:rFonts w:ascii="Arial" w:hAnsi="Arial" w:eastAsia="Microsoft YaHei"/>
-          <w:b w:val="0"/>
-          <w:i w:val="0"/>
-          <w:color w:val="111827"/>
-          <w:sz w:val="15"/>
-        </w:rPr>
-        <w:t>•  硕士论文：基于视觉、音频与时序不一致性分析的多模态深度伪造视频检测框架。</w:t>
+        <w:t>•  开发 PyTorch 分布式命令行工具，支持多节点训练任务的启动与监控，并具备故障检测、自动重试与断点恢复。</w:t>
       </w:r>
     </w:p>
     <w:p>
@@ -3078,7 +3015,7 @@
                 <w:color w:val="111827"/>
                 <w:sz w:val="14"/>
               </w:rPr>
-              <w:t>编程语言</w:t>
+              <w:t>大模型推理与系统</w:t>
             </w:r>
           </w:p>
         </w:tc>
@@ -3099,7 +3036,7 @@
                 <w:color w:val="111827"/>
                 <w:sz w:val="14"/>
               </w:rPr>
-              <w:t>Python（主语言）、C、C++、Java、SQL、Bash</w:t>
+              <w:t>SGLang, vLLM, KV Cache, PD 分离, Mooncake/RDMA, 连续批处理, RadixAttention</w:t>
             </w:r>
           </w:p>
         </w:tc>
@@ -3122,7 +3059,7 @@
                 <w:color w:val="111827"/>
                 <w:sz w:val="14"/>
               </w:rPr>
-              <w:t>AI / ML</w:t>
+              <w:t>GPU 与性能</w:t>
             </w:r>
           </w:p>
         </w:tc>
@@ -3143,7 +3080,7 @@
                 <w:color w:val="111827"/>
                 <w:sz w:val="14"/>
               </w:rPr>
-              <w:t>PyTorch、TensorFlow、Transformers、scikit-learn、NumPy；深度学习、模型评估与指标</w:t>
+              <w:t>CUDA, CUDA C++, Triton, Nsight Systems, Nsight Compute, PyTorch Profiler, GEMM 优化, FP8/FP4/INT4</w:t>
             </w:r>
           </w:p>
         </w:tc>
@@ -3166,7 +3103,7 @@
                 <w:color w:val="111827"/>
                 <w:sz w:val="14"/>
               </w:rPr>
-              <w:t>大模型与服务</w:t>
+              <w:t>机器学习与多模态</w:t>
             </w:r>
           </w:p>
         </w:tc>
@@ -3187,7 +3124,7 @@
                 <w:color w:val="111827"/>
                 <w:sz w:val="14"/>
               </w:rPr>
-              <w:t>大模型推理与服务（SGLang、vLLM）、RAG、智能体、微调（LoRA/QLoRA）、量化（FP8/INT4）</w:t>
+              <w:t>PyTorch, Hugging Face Transformers, Diffusion/DiT, 多模态学习, OpenCV</w:t>
             </w:r>
           </w:p>
         </w:tc>
@@ -3210,7 +3147,7 @@
                 <w:color w:val="111827"/>
                 <w:sz w:val="14"/>
               </w:rPr>
-              <w:t>GPU 与系统</w:t>
+              <w:t>分布式系统</w:t>
             </w:r>
           </w:p>
         </w:tc>
@@ -3231,7 +3168,7 @@
                 <w:color w:val="111827"/>
                 <w:sz w:val="14"/>
               </w:rPr>
-              <w:t>CUDA、Triton、FlashAttention、多卡/分布式训练（DDP、FSDP）、PyTorch Profiler、Nsight</w:t>
+              <w:t>PyTorch Distributed, Docker, Kubernetes, Linux, Prometheus, CI/CD</w:t>
             </w:r>
           </w:p>
         </w:tc>
@@ -3254,7 +3191,7 @@
                 <w:color w:val="111827"/>
                 <w:sz w:val="14"/>
               </w:rPr>
-              <w:t>计算机视觉与生成式 AI</w:t>
+              <w:t>编程语言</w:t>
             </w:r>
           </w:p>
         </w:tc>
@@ -3275,139 +3212,7 @@
                 <w:color w:val="111827"/>
                 <w:sz w:val="14"/>
               </w:rPr>
-              <w:t>CNN、Vision Transformers、扩散模型（DDPM/DiT）、视频生成、多模态学习、OpenCV</w:t>
-            </w:r>
-          </w:p>
-        </w:tc>
-      </w:tr>
-      <w:tr>
-        <w:tc>
-          <w:tcPr>
-            <w:tcW w:type="dxa" w:w="1700"/>
-          </w:tcPr>
-          <w:p>
-            <w:pPr>
-              <w:spacing w:after="30" w:before="0"/>
-              <w:jc w:val="both"/>
-            </w:pPr>
-            <w:r>
-              <w:rPr>
-                <w:rFonts w:ascii="Arial" w:hAnsi="Arial" w:eastAsia="Microsoft YaHei"/>
-                <w:b/>
-                <w:i w:val="0"/>
-                <w:color w:val="111827"/>
-                <w:sz w:val="14"/>
-              </w:rPr>
-              <w:t>数据与 MLOps</w:t>
-            </w:r>
-          </w:p>
-        </w:tc>
-        <w:tc>
-          <w:tcPr>
-            <w:tcW w:type="dxa" w:w="8957"/>
-          </w:tcPr>
-          <w:p>
-            <w:pPr>
-              <w:spacing w:after="30" w:before="0"/>
-              <w:jc w:val="both"/>
-            </w:pPr>
-            <w:r>
-              <w:rPr>
-                <w:rFonts w:ascii="Arial" w:hAnsi="Arial" w:eastAsia="Microsoft YaHei"/>
-                <w:b w:val="0"/>
-                <w:i w:val="0"/>
-                <w:color w:val="111827"/>
-                <w:sz w:val="14"/>
-              </w:rPr>
-              <w:t>Pandas、Docker、Kubernetes、Git、CI/CD、Slurm、AWS / GCP、Apache Spark、Weights &amp; Biases / MLflow</w:t>
-            </w:r>
-          </w:p>
-        </w:tc>
-      </w:tr>
-      <w:tr>
-        <w:tc>
-          <w:tcPr>
-            <w:tcW w:type="dxa" w:w="1700"/>
-          </w:tcPr>
-          <w:p>
-            <w:pPr>
-              <w:spacing w:after="30" w:before="0"/>
-              <w:jc w:val="both"/>
-            </w:pPr>
-            <w:r>
-              <w:rPr>
-                <w:rFonts w:ascii="Arial" w:hAnsi="Arial" w:eastAsia="Microsoft YaHei"/>
-                <w:b/>
-                <w:i w:val="0"/>
-                <w:color w:val="111827"/>
-                <w:sz w:val="14"/>
-              </w:rPr>
-              <w:t>数学与理论</w:t>
-            </w:r>
-          </w:p>
-        </w:tc>
-        <w:tc>
-          <w:tcPr>
-            <w:tcW w:type="dxa" w:w="8957"/>
-          </w:tcPr>
-          <w:p>
-            <w:pPr>
-              <w:spacing w:after="30" w:before="0"/>
-              <w:jc w:val="both"/>
-            </w:pPr>
-            <w:r>
-              <w:rPr>
-                <w:rFonts w:ascii="Arial" w:hAnsi="Arial" w:eastAsia="Microsoft YaHei"/>
-                <w:b w:val="0"/>
-                <w:i w:val="0"/>
-                <w:color w:val="111827"/>
-                <w:sz w:val="14"/>
-              </w:rPr>
-              <w:t>线性代数、概率与统计、优化、凸优化、信息论</w:t>
-            </w:r>
-          </w:p>
-        </w:tc>
-      </w:tr>
-      <w:tr>
-        <w:tc>
-          <w:tcPr>
-            <w:tcW w:type="dxa" w:w="1700"/>
-          </w:tcPr>
-          <w:p>
-            <w:pPr>
-              <w:spacing w:after="30" w:before="0"/>
-              <w:jc w:val="both"/>
-            </w:pPr>
-            <w:r>
-              <w:rPr>
-                <w:rFonts w:ascii="Arial" w:hAnsi="Arial" w:eastAsia="Microsoft YaHei"/>
-                <w:b/>
-                <w:i w:val="0"/>
-                <w:color w:val="111827"/>
-                <w:sz w:val="14"/>
-              </w:rPr>
-              <w:t>基础</w:t>
-            </w:r>
-          </w:p>
-        </w:tc>
-        <w:tc>
-          <w:tcPr>
-            <w:tcW w:type="dxa" w:w="8957"/>
-          </w:tcPr>
-          <w:p>
-            <w:pPr>
-              <w:spacing w:after="30" w:before="0"/>
-              <w:jc w:val="both"/>
-            </w:pPr>
-            <w:r>
-              <w:rPr>
-                <w:rFonts w:ascii="Arial" w:hAnsi="Arial" w:eastAsia="Microsoft YaHei"/>
-                <w:b w:val="0"/>
-                <w:i w:val="0"/>
-                <w:color w:val="111827"/>
-                <w:sz w:val="14"/>
-              </w:rPr>
-              <w:t>数据结构与算法、并发、操作系统、计算机网络、分布式系统</w:t>
+              <w:t>Python, C++, CUDA C++, Bash, SQL, 数据结构与算法</w:t>
             </w:r>
           </w:p>
         </w:tc>
@@ -3471,7 +3276,7 @@
           <w:color w:val="4A5568"/>
           <w:sz w:val="14"/>
         </w:rPr>
-        <w:t>GPA: 88/100 | 前 1% | 中国政府奖学金 | 国际学生联合会主席 (ISU)</w:t>
+        <w:t>GPA: 88/100, 前 1%, 中国政府奖学金, 国际学生联合会主席 (ISU)</w:t>
       </w:r>
     </w:p>
     <w:p>
@@ -3513,7 +3318,7 @@
           <w:color w:val="4A5568"/>
           <w:sz w:val="14"/>
         </w:rPr>
-        <w:t>GPA: 85/100 | 前 1% | 校长奖学金 | 最佳本科毕业论文奖</w:t>
+        <w:t>GPA: 85/100, 前 1%, 校长奖学金, 最佳本科毕业论文奖</w:t>
       </w:r>
     </w:p>
     <w:p>
@@ -3548,7 +3353,7 @@
           <w:color w:val="111827"/>
           <w:sz w:val="14"/>
         </w:rPr>
-        <w:t>论文：</w:t>
+        <w:t>第一作者</w:t>
       </w:r>
       <w:r>
         <w:rPr>
@@ -3558,7 +3363,7 @@
           <w:color w:val="111827"/>
           <w:sz w:val="14"/>
         </w:rPr>
-        <w:t>第一作者，《NVFP4-DiT：面向低成本视频生成的高效 4 比特音频引导视频扩散 Transformer》 - IEEE TNNLS（Q1），审稿中。</w:t>
+        <w:t xml:space="preserve"> — 《NVFP4-DiT：面向低成本视频生成的高效 4 比特音频引导视频扩散 Transformer》 — IEEE TNNLS（Q1），审稿中。</w:t>
       </w:r>
     </w:p>
     <w:p>
@@ -3584,9 +3389,9 @@
           <w:color w:val="111827"/>
           <w:sz w:val="14"/>
         </w:rPr>
-        <w:t>中国政府奖学金（2024-2027）；校长奖学金（2020-2024）；最佳本科毕业论文奖（2024）；西北工业大学</w:t>
+        <w:t>中国政府奖学金（2024-2027）；校长奖学金（2020-2024）；吴亚军奖学金（2024）；最佳本科毕业论文奖（2024）；西北工业大学</w:t>
       </w:r>
-      <w:hyperlink r:id="rId23">
+      <w:hyperlink r:id="rId21">
         <w:r>
           <w:rPr>
             <w:rFonts w:ascii="Arial" w:hAnsi="Arial" w:eastAsia="Microsoft YaHei"/>
@@ -3604,6 +3409,32 @@
           <w:sz w:val="14"/>
         </w:rPr>
         <w:t>（2024）；NWPU AI 挑战赛黑客松冠军（2023）。</w:t>
+      </w:r>
+    </w:p>
+    <w:p>
+      <w:pPr>
+        <w:spacing w:before="0" w:after="40" w:line="240" w:lineRule="auto"/>
+        <w:jc w:val="both"/>
+      </w:pPr>
+      <w:r>
+        <w:rPr>
+          <w:rFonts w:ascii="Arial" w:hAnsi="Arial" w:eastAsia="Microsoft YaHei"/>
+          <w:b/>
+          <w:i w:val="0"/>
+          <w:color w:val="111827"/>
+          <w:sz w:val="14"/>
+        </w:rPr>
+        <w:t>认证：</w:t>
+      </w:r>
+      <w:r>
+        <w:rPr>
+          <w:rFonts w:ascii="Arial" w:hAnsi="Arial" w:eastAsia="Microsoft YaHei"/>
+          <w:b w:val="0"/>
+          <w:i w:val="0"/>
+          <w:color w:val="111827"/>
+          <w:sz w:val="14"/>
+        </w:rPr>
+        <w:t>AWS 认证机器学习 — 专业级；Professional Scrum Master I（PSM I），Scrum.org；Deep Learning 专项课程，DeepLearning.AI。</w:t>
       </w:r>
     </w:p>
     <w:sectPr>

</xml_diff>

<commit_message>
Combine cover letter + resume into a single .docx (rebuilt from source)
</commit_message>
<xml_diff>
--- a/Resume_Raihan_NWPU_MS_2027.docx
+++ b/Resume_Raihan_NWPU_MS_2027.docx
@@ -2,6 +2,820 @@
 <file path=word/document.xml><?xml version="1.0" encoding="utf-8"?>
 <w:document xmlns:wpc="http://schemas.microsoft.com/office/word/2010/wordprocessingCanvas" xmlns:mo="http://schemas.microsoft.com/office/mac/office/2008/main" xmlns:mc="http://schemas.openxmlformats.org/markup-compatibility/2006" xmlns:mv="urn:schemas-microsoft-com:mac:vml" xmlns:o="urn:schemas-microsoft-com:office:office" xmlns:r="http://schemas.openxmlformats.org/officeDocument/2006/relationships" xmlns:m="http://schemas.openxmlformats.org/officeDocument/2006/math" xmlns:v="urn:schemas-microsoft-com:vml" xmlns:wp14="http://schemas.microsoft.com/office/word/2010/wordprocessingDrawing" xmlns:wp="http://schemas.openxmlformats.org/drawingml/2006/wordprocessingDrawing" xmlns:w10="urn:schemas-microsoft-com:office:word" xmlns:w="http://schemas.openxmlformats.org/wordprocessingml/2006/main" xmlns:w14="http://schemas.microsoft.com/office/word/2010/wordml" xmlns:wpg="http://schemas.microsoft.com/office/word/2010/wordprocessingGroup" xmlns:wpi="http://schemas.microsoft.com/office/word/2010/wordprocessingInk" xmlns:wne="http://schemas.microsoft.com/office/word/2006/wordml" xmlns:wps="http://schemas.microsoft.com/office/word/2010/wordprocessingShape" mc:Ignorable="w14 wp14">
   <w:body>
+    <w:tbl>
+      <w:tblPr>
+        <w:tblW w:type="dxa" w:w="10658"/>
+        <w:tblLayout w:type="fixed"/>
+        <w:tblLook w:firstColumn="1" w:firstRow="1" w:lastColumn="0" w:lastRow="0" w:noHBand="0" w:noVBand="1" w:val="04A0"/>
+      </w:tblPr>
+      <w:tblGrid>
+        <w:gridCol w:w="9705"/>
+        <w:gridCol w:w="952"/>
+      </w:tblGrid>
+      <w:tr>
+        <w:tc>
+          <w:tcPr>
+            <w:tcW w:type="dxa" w:w="9705"/>
+          </w:tcPr>
+          <w:p/>
+          <w:p>
+            <w:pPr>
+              <w:spacing w:before="0" w:after="20" w:line="240" w:lineRule="auto"/>
+              <w:jc w:val="both"/>
+            </w:pPr>
+            <w:r>
+              <w:rPr>
+                <w:rFonts w:ascii="Arial" w:hAnsi="Arial" w:eastAsia="Microsoft YaHei"/>
+                <w:b/>
+                <w:i w:val="0"/>
+                <w:color w:val="111827"/>
+                <w:sz w:val="25"/>
+              </w:rPr>
+              <w:t>MD RAKIBUL ISLAM RAIHAN</w:t>
+            </w:r>
+          </w:p>
+          <w:p>
+            <w:pPr>
+              <w:spacing w:before="0" w:after="20" w:line="240" w:lineRule="auto"/>
+              <w:jc w:val="both"/>
+            </w:pPr>
+            <w:r>
+              <w:rPr>
+                <w:rFonts w:ascii="Arial" w:hAnsi="Arial" w:eastAsia="Microsoft YaHei"/>
+                <w:b/>
+                <w:i w:val="0"/>
+                <w:color w:val="1F3864"/>
+                <w:sz w:val="15"/>
+              </w:rPr>
+              <w:t>ML Systems Engineer | LLM Inference &amp; Multimodal AI</w:t>
+            </w:r>
+          </w:p>
+          <w:p>
+            <w:pPr>
+              <w:spacing w:before="0" w:after="20" w:line="240" w:lineRule="auto"/>
+              <w:jc w:val="both"/>
+            </w:pPr>
+            <w:r>
+              <w:rPr>
+                <w:rFonts w:ascii="Arial" w:hAnsi="Arial" w:eastAsia="Microsoft YaHei"/>
+                <w:b w:val="0"/>
+                <w:i w:val="0"/>
+                <w:color w:val="4A5568"/>
+                <w:sz w:val="13"/>
+              </w:rPr>
+              <w:t>2027 New Grad · Available July 2027 · Open to Relocation · Xi'an, China</w:t>
+            </w:r>
+          </w:p>
+          <w:p>
+            <w:pPr>
+              <w:spacing w:before="0" w:after="20" w:line="240" w:lineRule="auto"/>
+              <w:jc w:val="both"/>
+            </w:pPr>
+          </w:p>
+          <w:p>
+            <w:pPr>
+              <w:spacing w:before="0" w:after="20" w:line="240" w:lineRule="auto"/>
+              <w:jc w:val="both"/>
+            </w:pPr>
+            <w:r>
+              <w:rPr>
+                <w:rFonts w:ascii="Arial" w:hAnsi="Arial" w:eastAsia="Microsoft YaHei"/>
+                <w:b w:val="0"/>
+                <w:i w:val="0"/>
+                <w:color w:val="4A5568"/>
+                <w:sz w:val="13"/>
+              </w:rPr>
+              <w:t xml:space="preserve">Email: </w:t>
+            </w:r>
+            <w:hyperlink r:id="rId9">
+              <w:r>
+                <w:rPr>
+                  <w:rFonts w:ascii="Arial" w:hAnsi="Arial" w:eastAsia="Microsoft YaHei"/>
+                  <w:sz w:val="13"/>
+                </w:rPr>
+                <w:t>raihanrakib.143@gmail.com</w:t>
+              </w:r>
+            </w:hyperlink>
+            <w:r>
+              <w:rPr>
+                <w:rFonts w:ascii="Arial" w:hAnsi="Arial" w:eastAsia="Microsoft YaHei"/>
+                <w:b w:val="0"/>
+                <w:i w:val="0"/>
+                <w:color w:val="4A5568"/>
+                <w:sz w:val="13"/>
+              </w:rPr>
+              <w:t xml:space="preserve"> · Phone: </w:t>
+            </w:r>
+            <w:hyperlink r:id="rId10">
+              <w:r>
+                <w:rPr>
+                  <w:rFonts w:ascii="Arial" w:hAnsi="Arial" w:eastAsia="Microsoft YaHei"/>
+                  <w:sz w:val="13"/>
+                </w:rPr>
+                <w:t>+86 177 2236 2949</w:t>
+              </w:r>
+            </w:hyperlink>
+          </w:p>
+          <w:p>
+            <w:pPr>
+              <w:spacing w:before="0" w:after="20" w:line="240" w:lineRule="auto"/>
+              <w:jc w:val="both"/>
+            </w:pPr>
+            <w:r>
+              <w:rPr>
+                <w:rFonts w:ascii="Arial" w:hAnsi="Arial" w:eastAsia="Microsoft YaHei"/>
+                <w:b w:val="0"/>
+                <w:i w:val="0"/>
+                <w:color w:val="4A5568"/>
+                <w:sz w:val="13"/>
+              </w:rPr>
+              <w:t xml:space="preserve">GitHub: </w:t>
+            </w:r>
+            <w:hyperlink r:id="rId11">
+              <w:r>
+                <w:rPr>
+                  <w:rFonts w:ascii="Arial" w:hAnsi="Arial" w:eastAsia="Microsoft YaHei"/>
+                  <w:sz w:val="13"/>
+                </w:rPr>
+                <w:t>github.com/theraihanrakibb</w:t>
+              </w:r>
+            </w:hyperlink>
+            <w:r>
+              <w:rPr>
+                <w:rFonts w:ascii="Arial" w:hAnsi="Arial" w:eastAsia="Microsoft YaHei"/>
+                <w:b w:val="0"/>
+                <w:i w:val="0"/>
+                <w:color w:val="4A5568"/>
+                <w:sz w:val="13"/>
+              </w:rPr>
+              <w:t xml:space="preserve"> · LinkedIn: </w:t>
+            </w:r>
+            <w:hyperlink r:id="rId12">
+              <w:r>
+                <w:rPr>
+                  <w:rFonts w:ascii="Arial" w:hAnsi="Arial" w:eastAsia="Microsoft YaHei"/>
+                  <w:sz w:val="13"/>
+                </w:rPr>
+                <w:t>linkedin.com/in/theraihanrakib</w:t>
+              </w:r>
+            </w:hyperlink>
+            <w:r>
+              <w:rPr>
+                <w:rFonts w:ascii="Arial" w:hAnsi="Arial" w:eastAsia="Microsoft YaHei"/>
+                <w:b w:val="0"/>
+                <w:i w:val="0"/>
+                <w:color w:val="4A5568"/>
+                <w:sz w:val="13"/>
+              </w:rPr>
+              <w:t xml:space="preserve"> · Portfolio: </w:t>
+            </w:r>
+            <w:hyperlink r:id="rId13">
+              <w:r>
+                <w:rPr>
+                  <w:rFonts w:ascii="Arial" w:hAnsi="Arial" w:eastAsia="Microsoft YaHei"/>
+                  <w:sz w:val="13"/>
+                </w:rPr>
+                <w:t>theraihanrakibb.github.io</w:t>
+              </w:r>
+            </w:hyperlink>
+          </w:p>
+        </w:tc>
+        <w:tc>
+          <w:tcPr>
+            <w:tcW w:type="dxa" w:w="952"/>
+          </w:tcPr>
+          <w:p>
+            <w:pPr>
+              <w:spacing w:before="40"/>
+              <w:jc w:val="right"/>
+            </w:pPr>
+            <w:r>
+              <w:drawing>
+                <wp:inline xmlns:a="http://schemas.openxmlformats.org/drawingml/2006/main" xmlns:pic="http://schemas.openxmlformats.org/drawingml/2006/picture">
+                  <wp:extent cx="604929" cy="756000"/>
+                  <wp:docPr id="1" name="Picture 1"/>
+                  <wp:cNvGraphicFramePr>
+                    <a:graphicFrameLocks noChangeAspect="1"/>
+                  </wp:cNvGraphicFramePr>
+                  <a:graphic>
+                    <a:graphicData uri="http://schemas.openxmlformats.org/drawingml/2006/picture">
+                      <pic:pic>
+                        <pic:nvPicPr>
+                          <pic:cNvPr id="0" name="Raihan.png"/>
+                          <pic:cNvPicPr/>
+                        </pic:nvPicPr>
+                        <pic:blipFill>
+                          <a:blip r:embed="rId14"/>
+                          <a:stretch>
+                            <a:fillRect/>
+                          </a:stretch>
+                        </pic:blipFill>
+                        <pic:spPr>
+                          <a:xfrm>
+                            <a:off x="0" y="0"/>
+                            <a:ext cx="604929" cy="756000"/>
+                          </a:xfrm>
+                          <a:prstGeom prst="rect"/>
+                        </pic:spPr>
+                      </pic:pic>
+                    </a:graphicData>
+                  </a:graphic>
+                </wp:inline>
+              </w:drawing>
+            </w:r>
+          </w:p>
+        </w:tc>
+      </w:tr>
+    </w:tbl>
+    <w:p>
+      <w:pPr>
+        <w:pBdr>
+          <w:bottom w:val="single" w:sz="6" w:space="1" w:color="1F3864"/>
+        </w:pBdr>
+      </w:pPr>
+    </w:p>
+    <w:p>
+      <w:pPr>
+        <w:spacing w:before="0" w:after="120" w:line="240" w:lineRule="auto"/>
+        <w:jc w:val="left"/>
+      </w:pPr>
+      <w:r>
+        <w:rPr>
+          <w:rFonts w:ascii="Arial" w:hAnsi="Arial" w:eastAsia="Microsoft YaHei"/>
+          <w:b w:val="0"/>
+          <w:i w:val="0"/>
+          <w:color w:val="111827"/>
+          <w:sz w:val="17"/>
+        </w:rPr>
+        <w:t>Dear Hiring Manager,</w:t>
+      </w:r>
+    </w:p>
+    <w:p>
+      <w:pPr>
+        <w:spacing w:before="0" w:after="120" w:line="240" w:lineRule="auto"/>
+        <w:jc w:val="both"/>
+      </w:pPr>
+      <w:r>
+        <w:rPr>
+          <w:rFonts w:ascii="Arial" w:hAnsi="Arial" w:eastAsia="Microsoft YaHei"/>
+          <w:b w:val="0"/>
+          <w:i w:val="0"/>
+          <w:color w:val="111827"/>
+          <w:sz w:val="17"/>
+        </w:rPr>
+        <w:t>I am writing to express my interest in engineering and research opportunities at your organization. I am a Software Engineering master's student at Northwestern Polytechnical University (NWPU), graduating in July 2027, with hands-on experience in large language model inference, GPU performance optimization, AI infrastructure, and multimodal generative AI research. I am particularly interested in building AI systems that are not only capable, but also efficient, scalable, and reliable in real-world deployment.</w:t>
+      </w:r>
+    </w:p>
+    <w:p>
+      <w:pPr>
+        <w:spacing w:before="0" w:after="120" w:line="240" w:lineRule="auto"/>
+        <w:jc w:val="both"/>
+      </w:pPr>
+      <w:r>
+        <w:rPr>
+          <w:rFonts w:ascii="Arial" w:hAnsi="Arial" w:eastAsia="Microsoft YaHei"/>
+          <w:b w:val="0"/>
+          <w:i w:val="0"/>
+          <w:color w:val="111827"/>
+          <w:sz w:val="17"/>
+        </w:rPr>
+        <w:t>At InfiX.ai, I worked on production LLM inference across NVIDIA A800 and H200 GPU infrastructure, tackling performance challenges involving memory management, distributed execution, and model serving. I reduced long-context time to first token from 55 seconds to 6.7 seconds through a three-tier KV-cache offloading architecture spanning GPU HBM, CPU DRAM, and SSD storage over RDMA. I also increased stable serving concurrency from 192 to 256 through prefill-decode disaggregation and RDMA-based KV transfer. In addition, I modified SGLang's cache and memory-management components, investigated production serving failures, and used performance profiling to identify optimization opportunities across the inference stack. These experiences taught me to approach AI performance as a systems problem, connecting software architecture, memory movement, communication overhead, and GPU computation.</w:t>
+      </w:r>
+    </w:p>
+    <w:p>
+      <w:pPr>
+        <w:spacing w:before="0" w:after="120" w:line="240" w:lineRule="auto"/>
+        <w:jc w:val="both"/>
+      </w:pPr>
+      <w:r>
+        <w:rPr>
+          <w:rFonts w:ascii="Arial" w:hAnsi="Arial" w:eastAsia="Microsoft YaHei"/>
+          <w:b w:val="0"/>
+          <w:i w:val="0"/>
+          <w:color w:val="111827"/>
+          <w:sz w:val="17"/>
+        </w:rPr>
+        <w:t>Alongside my engineering work, I conduct research at NWPU on efficient multimodal generative AI. As the first author of a manuscript currently under review at IEEE Transactions on Neural Networks and Learning Systems (TNNLS), I have investigated NVFP4 quantization and custom Triton kernels for audio-guided video diffusion transformers. In my evaluated setting, this work achieved a 4x reduction in memory usage, with optimized kernels delivering up to 3.2x speedup over FP16. My research has strengthened my understanding of low-precision computation, GPU kernel optimization, and the practical trade-offs involved in deploying computationally demanding AI models.</w:t>
+      </w:r>
+    </w:p>
+    <w:p>
+      <w:pPr>
+        <w:spacing w:before="0" w:after="120" w:line="240" w:lineRule="auto"/>
+        <w:jc w:val="both"/>
+      </w:pPr>
+      <w:r>
+        <w:rPr>
+          <w:rFonts w:ascii="Arial" w:hAnsi="Arial" w:eastAsia="Microsoft YaHei"/>
+          <w:b w:val="0"/>
+          <w:i w:val="0"/>
+          <w:color w:val="111827"/>
+          <w:sz w:val="17"/>
+        </w:rPr>
+        <w:t>I also bring experience in full-stack software development, distributed computing, and containerized AI infrastructure. Across these projects, I have learned to move between experimentation and implementation: identifying bottlenecks, evaluating potential solutions, measuring performance, and building systems that can be reproduced and maintained. I believe this combination of systems-level engineering and research-driven problem solving would allow me to contribute across a range of AI engineering teams, from inference and infrastructure to GPU optimization and multimodal AI.</w:t>
+      </w:r>
+    </w:p>
+    <w:p>
+      <w:pPr>
+        <w:spacing w:before="0" w:after="120" w:line="240" w:lineRule="auto"/>
+        <w:jc w:val="both"/>
+      </w:pPr>
+      <w:r>
+        <w:rPr>
+          <w:rFonts w:ascii="Arial" w:hAnsi="Arial" w:eastAsia="Microsoft YaHei"/>
+          <w:b w:val="0"/>
+          <w:i w:val="0"/>
+          <w:color w:val="111827"/>
+          <w:sz w:val="17"/>
+        </w:rPr>
+        <w:t>I would welcome the opportunity to bring my technical background, analytical approach, and commitment to measurable engineering outcomes to your team. I am eager to contribute to challenging AI systems projects while continuing to grow as an engineer working at the intersection of machine learning and high-performance computing.</w:t>
+      </w:r>
+    </w:p>
+    <w:p>
+      <w:pPr>
+        <w:spacing w:before="0" w:after="120" w:line="240" w:lineRule="auto"/>
+        <w:jc w:val="both"/>
+      </w:pPr>
+      <w:r>
+        <w:rPr>
+          <w:rFonts w:ascii="Arial" w:hAnsi="Arial" w:eastAsia="Microsoft YaHei"/>
+          <w:b w:val="0"/>
+          <w:i w:val="0"/>
+          <w:color w:val="111827"/>
+          <w:sz w:val="17"/>
+        </w:rPr>
+        <w:t>Thank you for your time and consideration. I look forward to the opportunity to discuss how my experience and interests align with your organization's needs.</w:t>
+      </w:r>
+    </w:p>
+    <w:p>
+      <w:pPr>
+        <w:spacing w:before="120" w:after="40" w:line="240" w:lineRule="auto"/>
+        <w:jc w:val="left"/>
+      </w:pPr>
+      <w:r>
+        <w:rPr>
+          <w:rFonts w:ascii="Arial" w:hAnsi="Arial" w:eastAsia="Microsoft YaHei"/>
+          <w:b w:val="0"/>
+          <w:i w:val="0"/>
+          <w:color w:val="111827"/>
+          <w:sz w:val="17"/>
+        </w:rPr>
+        <w:t>Sincerely,</w:t>
+      </w:r>
+    </w:p>
+    <w:p>
+      <w:pPr>
+        <w:spacing w:before="0" w:after="0" w:line="240" w:lineRule="auto"/>
+        <w:jc w:val="left"/>
+      </w:pPr>
+      <w:r>
+        <w:rPr>
+          <w:rFonts w:ascii="Arial" w:hAnsi="Arial" w:eastAsia="Microsoft YaHei"/>
+          <w:b/>
+          <w:i w:val="0"/>
+          <w:color w:val="111827"/>
+          <w:sz w:val="18"/>
+        </w:rPr>
+        <w:t>MD RAKIBUL ISLAM RAIHAN</w:t>
+      </w:r>
+    </w:p>
+    <w:p>
+      <w:pPr>
+        <w:spacing w:before="0" w:after="0" w:line="240" w:lineRule="auto"/>
+        <w:jc w:val="left"/>
+      </w:pPr>
+      <w:r>
+        <w:rPr>
+          <w:rFonts w:ascii="Arial" w:hAnsi="Arial" w:eastAsia="Microsoft YaHei"/>
+          <w:b w:val="0"/>
+          <w:i w:val="0"/>
+          <w:color w:val="4A5568"/>
+          <w:sz w:val="17"/>
+        </w:rPr>
+        <w:t>M.Eng. Software Engineering, NWPU (Expected 2027)</w:t>
+      </w:r>
+    </w:p>
+    <w:p>
+      <w:r>
+        <w:br w:type="page"/>
+      </w:r>
+    </w:p>
+    <w:tbl>
+      <w:tblPr>
+        <w:tblW w:type="dxa" w:w="10658"/>
+        <w:tblLayout w:type="fixed"/>
+        <w:tblLook w:firstColumn="1" w:firstRow="1" w:lastColumn="0" w:lastRow="0" w:noHBand="0" w:noVBand="1" w:val="04A0"/>
+      </w:tblPr>
+      <w:tblGrid>
+        <w:gridCol w:w="9841"/>
+        <w:gridCol w:w="816"/>
+      </w:tblGrid>
+      <w:tr>
+        <w:tc>
+          <w:tcPr>
+            <w:tcW w:type="dxa" w:w="9841"/>
+          </w:tcPr>
+          <w:p/>
+          <w:p>
+            <w:pPr>
+              <w:spacing w:before="0" w:after="20" w:line="240" w:lineRule="auto"/>
+              <w:jc w:val="both"/>
+            </w:pPr>
+            <w:r>
+              <w:rPr>
+                <w:rFonts w:ascii="Arial" w:hAnsi="Arial" w:eastAsia="Microsoft YaHei"/>
+                <w:b/>
+                <w:i w:val="0"/>
+                <w:color w:val="111827"/>
+                <w:sz w:val="28"/>
+              </w:rPr>
+              <w:t>MD RAKIBUL ISLAM RAIHAN</w:t>
+            </w:r>
+          </w:p>
+          <w:p>
+            <w:pPr>
+              <w:spacing w:before="0" w:after="20" w:line="240" w:lineRule="auto"/>
+              <w:jc w:val="both"/>
+            </w:pPr>
+            <w:r>
+              <w:rPr>
+                <w:rFonts w:ascii="Arial" w:hAnsi="Arial" w:eastAsia="Microsoft YaHei"/>
+                <w:b/>
+                <w:i w:val="0"/>
+                <w:color w:val="1F3864"/>
+                <w:sz w:val="17"/>
+              </w:rPr>
+              <w:t>ML 系统工程师 | 大模型推理与多模态 AI</w:t>
+            </w:r>
+          </w:p>
+          <w:p>
+            <w:pPr>
+              <w:spacing w:before="0" w:after="20" w:line="240" w:lineRule="auto"/>
+              <w:jc w:val="both"/>
+            </w:pPr>
+            <w:r>
+              <w:rPr>
+                <w:rFonts w:ascii="Arial" w:hAnsi="Arial" w:eastAsia="Microsoft YaHei"/>
+                <w:b w:val="0"/>
+                <w:i w:val="0"/>
+                <w:color w:val="4A5568"/>
+                <w:sz w:val="15"/>
+              </w:rPr>
+              <w:t>2027 届应届 · 2027 年 7 月到岗 · 可接受异地 · 中国·西安</w:t>
+            </w:r>
+          </w:p>
+          <w:p>
+            <w:pPr>
+              <w:spacing w:before="0" w:after="20" w:line="240" w:lineRule="auto"/>
+              <w:jc w:val="both"/>
+            </w:pPr>
+          </w:p>
+          <w:p>
+            <w:pPr>
+              <w:spacing w:before="0" w:after="20" w:line="240" w:lineRule="auto"/>
+              <w:jc w:val="both"/>
+            </w:pPr>
+            <w:r>
+              <w:rPr>
+                <w:rFonts w:ascii="Arial" w:hAnsi="Arial" w:eastAsia="Microsoft YaHei"/>
+                <w:b w:val="0"/>
+                <w:i w:val="0"/>
+                <w:color w:val="4A5568"/>
+                <w:sz w:val="15"/>
+              </w:rPr>
+              <w:t xml:space="preserve">邮箱: </w:t>
+            </w:r>
+            <w:hyperlink r:id="rId9">
+              <w:r>
+                <w:rPr>
+                  <w:rFonts w:ascii="Arial" w:hAnsi="Arial" w:eastAsia="Microsoft YaHei"/>
+                  <w:sz w:val="15"/>
+                </w:rPr>
+                <w:t>raihanrakib.143@gmail.com</w:t>
+              </w:r>
+            </w:hyperlink>
+            <w:r>
+              <w:rPr>
+                <w:rFonts w:ascii="Arial" w:hAnsi="Arial" w:eastAsia="Microsoft YaHei"/>
+                <w:b w:val="0"/>
+                <w:i w:val="0"/>
+                <w:color w:val="4A5568"/>
+                <w:sz w:val="15"/>
+              </w:rPr>
+              <w:t xml:space="preserve"> · 电话: </w:t>
+            </w:r>
+            <w:hyperlink r:id="rId10">
+              <w:r>
+                <w:rPr>
+                  <w:rFonts w:ascii="Arial" w:hAnsi="Arial" w:eastAsia="Microsoft YaHei"/>
+                  <w:sz w:val="15"/>
+                </w:rPr>
+                <w:t>+86 177 2236 2949</w:t>
+              </w:r>
+            </w:hyperlink>
+            <w:r>
+              <w:rPr>
+                <w:rFonts w:ascii="Arial" w:hAnsi="Arial" w:eastAsia="Microsoft YaHei"/>
+                <w:b w:val="0"/>
+                <w:i w:val="0"/>
+                <w:color w:val="4A5568"/>
+                <w:sz w:val="15"/>
+              </w:rPr>
+              <w:t xml:space="preserve"> · 微信: imeddii</w:t>
+            </w:r>
+          </w:p>
+          <w:p>
+            <w:pPr>
+              <w:spacing w:before="0" w:after="20" w:line="240" w:lineRule="auto"/>
+              <w:jc w:val="both"/>
+            </w:pPr>
+            <w:r>
+              <w:rPr>
+                <w:rFonts w:ascii="Arial" w:hAnsi="Arial" w:eastAsia="Microsoft YaHei"/>
+                <w:b w:val="0"/>
+                <w:i w:val="0"/>
+                <w:color w:val="4A5568"/>
+                <w:sz w:val="15"/>
+              </w:rPr>
+              <w:t xml:space="preserve">&lt;font name="Times-Roman"&gt;GitHub: </w:t>
+            </w:r>
+            <w:hyperlink r:id="rId11">
+              <w:r>
+                <w:rPr>
+                  <w:rFonts w:ascii="Arial" w:hAnsi="Arial" w:eastAsia="Microsoft YaHei"/>
+                  <w:sz w:val="15"/>
+                </w:rPr>
+                <w:t>github.com/theraihanrakibb</w:t>
+              </w:r>
+            </w:hyperlink>
+            <w:r>
+              <w:rPr>
+                <w:rFonts w:ascii="Arial" w:hAnsi="Arial" w:eastAsia="Microsoft YaHei"/>
+                <w:b w:val="0"/>
+                <w:i w:val="0"/>
+                <w:color w:val="4A5568"/>
+                <w:sz w:val="15"/>
+              </w:rPr>
+              <w:t xml:space="preserve"> · LinkedIn: </w:t>
+            </w:r>
+            <w:hyperlink r:id="rId12">
+              <w:r>
+                <w:rPr>
+                  <w:rFonts w:ascii="Arial" w:hAnsi="Arial" w:eastAsia="Microsoft YaHei"/>
+                  <w:sz w:val="15"/>
+                </w:rPr>
+                <w:t>linkedin.com/in/theraihanrakib</w:t>
+              </w:r>
+            </w:hyperlink>
+            <w:r>
+              <w:rPr>
+                <w:rFonts w:ascii="Arial" w:hAnsi="Arial" w:eastAsia="Microsoft YaHei"/>
+                <w:b w:val="0"/>
+                <w:i w:val="0"/>
+                <w:color w:val="4A5568"/>
+                <w:sz w:val="15"/>
+              </w:rPr>
+              <w:t xml:space="preserve"> · Portfolio: </w:t>
+            </w:r>
+            <w:hyperlink r:id="rId13">
+              <w:r>
+                <w:rPr>
+                  <w:rFonts w:ascii="Arial" w:hAnsi="Arial" w:eastAsia="Microsoft YaHei"/>
+                  <w:sz w:val="15"/>
+                </w:rPr>
+                <w:t>theraihanrakibb.github.io</w:t>
+              </w:r>
+            </w:hyperlink>
+            <w:r>
+              <w:rPr>
+                <w:rFonts w:ascii="Arial" w:hAnsi="Arial" w:eastAsia="Microsoft YaHei"/>
+                <w:b w:val="0"/>
+                <w:i w:val="0"/>
+                <w:color w:val="4A5568"/>
+                <w:sz w:val="15"/>
+              </w:rPr>
+              <w:t>&lt;/font&gt;</w:t>
+            </w:r>
+          </w:p>
+        </w:tc>
+        <w:tc>
+          <w:tcPr>
+            <w:tcW w:type="dxa" w:w="816"/>
+          </w:tcPr>
+          <w:p>
+            <w:pPr>
+              <w:spacing w:before="40"/>
+              <w:jc w:val="right"/>
+            </w:pPr>
+            <w:r>
+              <w:drawing>
+                <wp:inline xmlns:a="http://schemas.openxmlformats.org/drawingml/2006/main" xmlns:pic="http://schemas.openxmlformats.org/drawingml/2006/picture">
+                  <wp:extent cx="518510" cy="648000"/>
+                  <wp:docPr id="2" name="Picture 2"/>
+                  <wp:cNvGraphicFramePr>
+                    <a:graphicFrameLocks noChangeAspect="1"/>
+                  </wp:cNvGraphicFramePr>
+                  <a:graphic>
+                    <a:graphicData uri="http://schemas.openxmlformats.org/drawingml/2006/picture">
+                      <pic:pic>
+                        <pic:nvPicPr>
+                          <pic:cNvPr id="0" name="Raihan.png"/>
+                          <pic:cNvPicPr/>
+                        </pic:nvPicPr>
+                        <pic:blipFill>
+                          <a:blip r:embed="rId14"/>
+                          <a:stretch>
+                            <a:fillRect/>
+                          </a:stretch>
+                        </pic:blipFill>
+                        <pic:spPr>
+                          <a:xfrm>
+                            <a:off x="0" y="0"/>
+                            <a:ext cx="518510" cy="648000"/>
+                          </a:xfrm>
+                          <a:prstGeom prst="rect"/>
+                        </pic:spPr>
+                      </pic:pic>
+                    </a:graphicData>
+                  </a:graphic>
+                </wp:inline>
+              </w:drawing>
+            </w:r>
+          </w:p>
+        </w:tc>
+      </w:tr>
+    </w:tbl>
+    <w:p>
+      <w:pPr>
+        <w:pBdr>
+          <w:bottom w:val="single" w:sz="6" w:space="1" w:color="1F3864"/>
+        </w:pBdr>
+      </w:pPr>
+    </w:p>
+    <w:p>
+      <w:pPr>
+        <w:spacing w:before="0" w:after="120" w:line="240" w:lineRule="auto"/>
+        <w:jc w:val="left"/>
+      </w:pPr>
+      <w:r>
+        <w:rPr>
+          <w:rFonts w:ascii="Arial" w:hAnsi="Arial" w:eastAsia="Microsoft YaHei"/>
+          <w:b w:val="0"/>
+          <w:i w:val="0"/>
+          <w:color w:val="111827"/>
+          <w:sz w:val="19"/>
+        </w:rPr>
+        <w:t>尊敬的招聘负责人：</w:t>
+      </w:r>
+    </w:p>
+    <w:p>
+      <w:pPr>
+        <w:spacing w:before="0" w:after="120" w:line="240" w:lineRule="auto"/>
+        <w:jc w:val="left"/>
+      </w:pPr>
+      <w:r>
+        <w:rPr>
+          <w:rFonts w:ascii="Arial" w:hAnsi="Arial" w:eastAsia="Microsoft YaHei"/>
+          <w:b w:val="0"/>
+          <w:i w:val="0"/>
+          <w:color w:val="111827"/>
+          <w:sz w:val="19"/>
+        </w:rPr>
+        <w:t>本人写信表达加入贵公司工程与研究岗位的意愿。我是西北工业大学（NWPU）软件工程硕士研究生，预计 2027 年 7 月毕业，在大语言模型推理、GPU 性能优化、AI 基础设施与多模态生成式 AI 研究方面具备实践经验。我尤其关注构建不仅能力强、而且在真实部署中高效、可扩展且可靠的 AI 系统。</w:t>
+      </w:r>
+    </w:p>
+    <w:p>
+      <w:pPr>
+        <w:spacing w:before="0" w:after="120" w:line="240" w:lineRule="auto"/>
+        <w:jc w:val="left"/>
+      </w:pPr>
+      <w:r>
+        <w:rPr>
+          <w:rFonts w:ascii="Arial" w:hAnsi="Arial" w:eastAsia="Microsoft YaHei"/>
+          <w:b w:val="0"/>
+          <w:i w:val="0"/>
+          <w:color w:val="111827"/>
+          <w:sz w:val="19"/>
+        </w:rPr>
+        <w:t>在 InfiX.ai，我基于 NVIDIA A800 与 H200 GPU 基础设施从事生产级大模型推理工作，解决涉及内存管理、分布式执行与模型服务的性能挑战。我通过跨越 GPU HBM、CPU DRAM 与 SSD 的三级 KV 缓存卸载架构（基于 RDMA），将长上下文首字延迟由 55 秒降至 6.7 秒；并通过 prefill-decode 分离与基于 RDMA 的 KV 传输，将稳定服务并发由 192 提升至 256。此外，我修改了 SGLang 的缓存与内存管理组件，排查生产服务故障，并使用性能分析定位整个推理栈的优化空间。这些经历让我学会把 AI 性能当作系统问题来处理——将软件架构、内存搬运、通信开销与 GPU 计算联系在一起。</w:t>
+      </w:r>
+    </w:p>
+    <w:p>
+      <w:pPr>
+        <w:spacing w:before="0" w:after="120" w:line="240" w:lineRule="auto"/>
+        <w:jc w:val="left"/>
+      </w:pPr>
+      <w:r>
+        <w:rPr>
+          <w:rFonts w:ascii="Arial" w:hAnsi="Arial" w:eastAsia="Microsoft YaHei"/>
+          <w:b w:val="0"/>
+          <w:i w:val="0"/>
+          <w:color w:val="111827"/>
+          <w:sz w:val="19"/>
+        </w:rPr>
+        <w:t>在工程工作之外，我在 NWPU 从事高效多模态生成式 AI 研究。作为目前在 IEEE 神经网络与学习系统汇刊（TNNLS）审稿中的论文第一作者，我研究了面向音频引导视频扩散 Transformer 的 NVFP4 量化与自研 Triton 算子。在我的评测设置中，该工作实现了 4 倍显存降低，优化后的算子相较 FP16 最高带来 3.2 倍加速。这段研究加深了我对低精度计算、GPU 算子优化，以及部署高算力 AI 模型时实际权衡的理解。</w:t>
+      </w:r>
+    </w:p>
+    <w:p>
+      <w:pPr>
+        <w:spacing w:before="0" w:after="120" w:line="240" w:lineRule="auto"/>
+        <w:jc w:val="left"/>
+      </w:pPr>
+      <w:r>
+        <w:rPr>
+          <w:rFonts w:ascii="Arial" w:hAnsi="Arial" w:eastAsia="Microsoft YaHei"/>
+          <w:b w:val="0"/>
+          <w:i w:val="0"/>
+          <w:color w:val="111827"/>
+          <w:sz w:val="19"/>
+        </w:rPr>
+        <w:t>我还具备全栈软件开发、分布式计算与容器化 AI 基础设施的经验。在这些项目中，我学会了在实验与实现之间往返：定位瓶颈、评估候选方案、测量性能，并构建可复现、可维护的系统。我认为这种系统级工程与研究驱动的问题求解相结合的能力，使我能够为从推理与基础设施，到 GPU 优化与多模态 AI 的各类 AI 工程团队作出贡献。</w:t>
+      </w:r>
+    </w:p>
+    <w:p>
+      <w:pPr>
+        <w:spacing w:before="0" w:after="120" w:line="240" w:lineRule="auto"/>
+        <w:jc w:val="left"/>
+      </w:pPr>
+      <w:r>
+        <w:rPr>
+          <w:rFonts w:ascii="Arial" w:hAnsi="Arial" w:eastAsia="Microsoft YaHei"/>
+          <w:b w:val="0"/>
+          <w:i w:val="0"/>
+          <w:color w:val="111827"/>
+          <w:sz w:val="19"/>
+        </w:rPr>
+        <w:t>我希望能有机会将我的技术背景、分析方法以及对可度量工程成果的坚持带入贵团队。我渴望参与富有挑战性的 AI 系统项目，并在机器学习与高性能计算的交叉领域持续成长为一名工程师。</w:t>
+      </w:r>
+    </w:p>
+    <w:p>
+      <w:pPr>
+        <w:spacing w:before="0" w:after="120" w:line="240" w:lineRule="auto"/>
+        <w:jc w:val="left"/>
+      </w:pPr>
+      <w:r>
+        <w:rPr>
+          <w:rFonts w:ascii="Arial" w:hAnsi="Arial" w:eastAsia="Microsoft YaHei"/>
+          <w:b w:val="0"/>
+          <w:i w:val="0"/>
+          <w:color w:val="111827"/>
+          <w:sz w:val="19"/>
+        </w:rPr>
+        <w:t>感谢您抽出时间阅读。期待有机会进一步沟通我的经验与兴趣如何契合贵公司的需求。</w:t>
+      </w:r>
+    </w:p>
+    <w:p>
+      <w:pPr>
+        <w:spacing w:before="120" w:after="40" w:line="240" w:lineRule="auto"/>
+        <w:jc w:val="left"/>
+      </w:pPr>
+      <w:r>
+        <w:rPr>
+          <w:rFonts w:ascii="Arial" w:hAnsi="Arial" w:eastAsia="Microsoft YaHei"/>
+          <w:b w:val="0"/>
+          <w:i w:val="0"/>
+          <w:color w:val="111827"/>
+          <w:sz w:val="19"/>
+        </w:rPr>
+        <w:t>此致 敬礼</w:t>
+      </w:r>
+    </w:p>
+    <w:p>
+      <w:pPr>
+        <w:spacing w:before="0" w:after="0" w:line="240" w:lineRule="auto"/>
+        <w:jc w:val="left"/>
+      </w:pPr>
+      <w:r>
+        <w:rPr>
+          <w:rFonts w:ascii="Arial" w:hAnsi="Arial" w:eastAsia="Microsoft YaHei"/>
+          <w:b/>
+          <w:i w:val="0"/>
+          <w:color w:val="111827"/>
+          <w:sz w:val="21"/>
+        </w:rPr>
+        <w:t>MD RAKIBUL ISLAM RAIHAN</w:t>
+      </w:r>
+    </w:p>
+    <w:p>
+      <w:pPr>
+        <w:spacing w:before="0" w:after="0" w:line="240" w:lineRule="auto"/>
+        <w:jc w:val="left"/>
+      </w:pPr>
+      <w:r>
+        <w:rPr>
+          <w:rFonts w:ascii="Arial" w:hAnsi="Arial" w:eastAsia="Microsoft YaHei"/>
+          <w:b w:val="0"/>
+          <w:i w:val="0"/>
+          <w:color w:val="4A5568"/>
+          <w:sz w:val="19"/>
+        </w:rPr>
+        <w:t>软件工程硕士，西北工业大学（预计 2027 年毕业）</w:t>
+      </w:r>
+    </w:p>
+    <w:p>
+      <w:r>
+        <w:br w:type="page"/>
+      </w:r>
+    </w:p>
     <w:tbl>
       <w:tblPr>
         <w:tblW w:type="dxa" w:w="10658"/>
@@ -193,7 +1007,7 @@
               <w:drawing>
                 <wp:inline xmlns:a="http://schemas.openxmlformats.org/drawingml/2006/main" xmlns:pic="http://schemas.openxmlformats.org/drawingml/2006/picture">
                   <wp:extent cx="604929" cy="756000"/>
-                  <wp:docPr id="1" name="Picture 1"/>
+                  <wp:docPr id="3" name="Picture 3"/>
                   <wp:cNvGraphicFramePr>
                     <a:graphicFrameLocks noChangeAspect="1"/>
                   </wp:cNvGraphicFramePr>
@@ -1932,7 +2746,7 @@
               <w:drawing>
                 <wp:inline xmlns:a="http://schemas.openxmlformats.org/drawingml/2006/main" xmlns:pic="http://schemas.openxmlformats.org/drawingml/2006/picture">
                   <wp:extent cx="518510" cy="648000"/>
-                  <wp:docPr id="2" name="Picture 2"/>
+                  <wp:docPr id="4" name="Picture 4"/>
                   <wp:cNvGraphicFramePr>
                     <a:graphicFrameLocks noChangeAspect="1"/>
                   </wp:cNvGraphicFramePr>
@@ -3437,6 +4251,11 @@
         <w:t>AWS 认证机器学习 — 专业级；Professional Scrum Master I（PSM I），Scrum.org；Deep Learning 专项课程，DeepLearning.AI。</w:t>
       </w:r>
     </w:p>
+    <w:p>
+      <w:r>
+        <w:br w:type="page"/>
+      </w:r>
+    </w:p>
     <w:sectPr>
       <w:pgSz w:w="12240" w:h="15840"/>
       <w:pgMar w:top="397" w:right="624" w:bottom="397" w:left="624" w:header="720" w:footer="720" w:gutter="0"/>

</xml_diff>